<commit_message>
Update project template risk section
</commit_message>
<xml_diff>
--- a/assets/docs/FCAI_C6_Project_Template.docx
+++ b/assets/docs/FCAI_C6_Project_Template.docx
@@ -5313,6 +5313,16 @@
           <w:sz w:val="18"/>
           <w:szCs w:val="18"/>
         </w:rPr>
+        <w:t xml:space="preserve">We suggest at least 2 milestones per quarter. </w:t>
+      </w:r>
+      <w:r>
+        <w:rPr>
+          <w:i/>
+          <w:iCs/>
+          <w:color w:val="425563"/>
+          <w:sz w:val="18"/>
+          <w:szCs w:val="18"/>
+        </w:rPr>
         <w:t>Add</w:t>
       </w:r>
       <w:r>
@@ -6690,7 +6700,7 @@
           <w:bCs/>
           <w:color w:val="003087"/>
         </w:rPr>
-        <w:t>Hazards</w:t>
+        <w:t>Risk assessment</w:t>
       </w:r>
     </w:p>
     <w:tbl>
@@ -6759,7 +6769,47 @@
                 <w:sz w:val="18"/>
                 <w:szCs w:val="18"/>
               </w:rPr>
-              <w:t xml:space="preserve"> hazards are appropriately identified, and reasonable mitigations are described.</w:t>
+              <w:t xml:space="preserve"> </w:t>
+            </w:r>
+            <w:r>
+              <w:rPr>
+                <w:color w:val="425563"/>
+                <w:sz w:val="18"/>
+                <w:szCs w:val="18"/>
+              </w:rPr>
+              <w:t>risks</w:t>
+            </w:r>
+            <w:r>
+              <w:rPr>
+                <w:color w:val="425563"/>
+                <w:sz w:val="18"/>
+                <w:szCs w:val="18"/>
+              </w:rPr>
+              <w:t xml:space="preserve"> </w:t>
+            </w:r>
+            <w:r>
+              <w:rPr>
+                <w:color w:val="425563"/>
+                <w:sz w:val="18"/>
+                <w:szCs w:val="18"/>
+              </w:rPr>
+              <w:t xml:space="preserve">from the fellow’s activity in the project </w:t>
+            </w:r>
+            <w:r>
+              <w:rPr>
+                <w:color w:val="425563"/>
+                <w:sz w:val="18"/>
+                <w:szCs w:val="18"/>
+              </w:rPr>
+              <w:t>are appropriately identified, reasonable mitigations are described</w:t>
+            </w:r>
+            <w:r>
+              <w:rPr>
+                <w:color w:val="425563"/>
+                <w:sz w:val="18"/>
+                <w:szCs w:val="18"/>
+              </w:rPr>
+              <w:t>, and acceptable residual risks.</w:t>
             </w:r>
           </w:p>
           <w:p>
@@ -6837,6 +6887,13 @@
     <w:p>
       <w:pPr>
         <w:spacing w:after="100"/>
+        <w:rPr>
+          <w:i/>
+          <w:iCs/>
+          <w:color w:val="425563"/>
+          <w:sz w:val="18"/>
+          <w:szCs w:val="18"/>
+        </w:rPr>
       </w:pPr>
       <w:r>
         <w:rPr>
@@ -6846,7 +6903,7 @@
           <w:sz w:val="18"/>
           <w:szCs w:val="18"/>
         </w:rPr>
-        <w:t>A hazard is a potential cause of harm; harm is an adverse event caused to an individual by a hazard; risk is the likelihood of that harm occurring. The hazards and mitigations below are pre-</w:t>
+        <w:t xml:space="preserve">This section concerns </w:t>
       </w:r>
       <w:r>
         <w:rPr>
@@ -6856,7 +6913,7 @@
           <w:sz w:val="18"/>
           <w:szCs w:val="18"/>
         </w:rPr>
-        <w:t>populated</w:t>
+        <w:t>assessing and mitigating risks</w:t>
       </w:r>
       <w:r>
         <w:rPr>
@@ -6866,7 +6923,42 @@
           <w:sz w:val="18"/>
           <w:szCs w:val="18"/>
         </w:rPr>
-        <w:t xml:space="preserve"> with those common to fellowship placements. For each them</w:t>
+        <w:t xml:space="preserve"> arising from the fellow's activity</w:t>
+      </w:r>
+      <w:r>
+        <w:rPr>
+          <w:i/>
+          <w:iCs/>
+          <w:color w:val="425563"/>
+          <w:sz w:val="18"/>
+          <w:szCs w:val="18"/>
+        </w:rPr>
+        <w:t xml:space="preserve"> and involvement</w:t>
+      </w:r>
+      <w:r>
+        <w:rPr>
+          <w:i/>
+          <w:iCs/>
+          <w:color w:val="425563"/>
+          <w:sz w:val="18"/>
+          <w:szCs w:val="18"/>
+        </w:rPr>
+        <w:t xml:space="preserve"> in this project</w:t>
+      </w:r>
+    </w:p>
+    <w:p>
+      <w:pPr>
+        <w:spacing w:after="100"/>
+      </w:pPr>
+      <w:r>
+        <w:rPr>
+          <w:i/>
+          <w:iCs/>
+          <w:color w:val="425563"/>
+          <w:sz w:val="18"/>
+          <w:szCs w:val="18"/>
+        </w:rPr>
+        <w:t>For each them</w:t>
       </w:r>
       <w:r>
         <w:rPr>
@@ -6886,7 +6978,67 @@
           <w:sz w:val="18"/>
           <w:szCs w:val="18"/>
         </w:rPr>
-        <w:t xml:space="preserve"> amend it </w:t>
+        <w:t xml:space="preserve"> review</w:t>
+      </w:r>
+      <w:r>
+        <w:rPr>
+          <w:i/>
+          <w:iCs/>
+          <w:color w:val="425563"/>
+          <w:sz w:val="18"/>
+          <w:szCs w:val="18"/>
+        </w:rPr>
+        <w:t xml:space="preserve"> </w:t>
+      </w:r>
+      <w:r>
+        <w:rPr>
+          <w:i/>
+          <w:iCs/>
+          <w:color w:val="425563"/>
+          <w:sz w:val="18"/>
+          <w:szCs w:val="18"/>
+        </w:rPr>
+        <w:t xml:space="preserve">&amp; </w:t>
+      </w:r>
+      <w:r>
+        <w:rPr>
+          <w:i/>
+          <w:iCs/>
+          <w:color w:val="425563"/>
+          <w:sz w:val="18"/>
+          <w:szCs w:val="18"/>
+        </w:rPr>
+        <w:t xml:space="preserve">amend </w:t>
+      </w:r>
+      <w:r>
+        <w:rPr>
+          <w:i/>
+          <w:iCs/>
+          <w:color w:val="425563"/>
+          <w:sz w:val="18"/>
+          <w:szCs w:val="18"/>
+        </w:rPr>
+        <w:t xml:space="preserve">the pro-populated </w:t>
+      </w:r>
+      <w:r>
+        <w:rPr>
+          <w:i/>
+          <w:iCs/>
+          <w:color w:val="425563"/>
+          <w:sz w:val="18"/>
+          <w:szCs w:val="18"/>
+        </w:rPr>
+        <w:t>lists</w:t>
+      </w:r>
+      <w:r>
+        <w:rPr>
+          <w:i/>
+          <w:iCs/>
+          <w:color w:val="425563"/>
+          <w:sz w:val="18"/>
+          <w:szCs w:val="18"/>
+        </w:rPr>
+        <w:t xml:space="preserve"> </w:t>
       </w:r>
       <w:r>
         <w:rPr>
@@ -6926,7 +7078,7 @@
           <w:sz w:val="18"/>
           <w:szCs w:val="18"/>
         </w:rPr>
-        <w:t>.</w:t>
+        <w:t>, t</w:t>
       </w:r>
       <w:r>
         <w:rPr>
@@ -6936,7 +7088,7 @@
           <w:sz w:val="18"/>
           <w:szCs w:val="18"/>
         </w:rPr>
-        <w:t xml:space="preserve"> </w:t>
+        <w:t xml:space="preserve">hen </w:t>
       </w:r>
       <w:r>
         <w:rPr>
@@ -6946,7 +7098,7 @@
           <w:sz w:val="18"/>
           <w:szCs w:val="18"/>
         </w:rPr>
-        <w:t>T</w:t>
+        <w:t>describe the</w:t>
       </w:r>
       <w:r>
         <w:rPr>
@@ -6956,57 +7108,7 @@
           <w:sz w:val="18"/>
           <w:szCs w:val="18"/>
         </w:rPr>
-        <w:t>hen rate the</w:t>
-      </w:r>
-      <w:r>
-        <w:rPr>
-          <w:i/>
-          <w:iCs/>
-          <w:color w:val="425563"/>
-          <w:sz w:val="18"/>
-          <w:szCs w:val="18"/>
-        </w:rPr>
-        <w:t xml:space="preserve"> highest remaining</w:t>
-      </w:r>
-      <w:r>
-        <w:rPr>
-          <w:i/>
-          <w:iCs/>
-          <w:color w:val="425563"/>
-          <w:sz w:val="18"/>
-          <w:szCs w:val="18"/>
-        </w:rPr>
-        <w:t xml:space="preserve"> residual risk </w:t>
-      </w:r>
-      <w:r>
-        <w:rPr>
-          <w:i/>
-          <w:iCs/>
-          <w:color w:val="425563"/>
-          <w:sz w:val="18"/>
-          <w:szCs w:val="18"/>
-        </w:rPr>
-        <w:t>(</w:t>
-      </w:r>
-      <w:r>
-        <w:rPr>
-          <w:i/>
-          <w:iCs/>
-          <w:color w:val="425563"/>
-          <w:sz w:val="18"/>
-          <w:szCs w:val="18"/>
-        </w:rPr>
-        <w:t>the likelihood of the harm once the mitigations are in place</w:t>
-      </w:r>
-      <w:r>
-        <w:rPr>
-          <w:i/>
-          <w:iCs/>
-          <w:color w:val="425563"/>
-          <w:sz w:val="18"/>
-          <w:szCs w:val="18"/>
-        </w:rPr>
-        <w:t>)</w:t>
+        <w:t xml:space="preserve"> residual risk</w:t>
       </w:r>
       <w:r>
         <w:rPr>
@@ -7037,11 +7139,11 @@
         <w:tblLook w:val="04A0" w:firstRow="1" w:lastRow="0" w:firstColumn="1" w:lastColumn="0" w:noHBand="0" w:noVBand="1"/>
       </w:tblPr>
       <w:tblGrid>
-        <w:gridCol w:w="1784"/>
-        <w:gridCol w:w="2165"/>
-        <w:gridCol w:w="3827"/>
-        <w:gridCol w:w="4590"/>
-        <w:gridCol w:w="1592"/>
+        <w:gridCol w:w="1413"/>
+        <w:gridCol w:w="2126"/>
+        <w:gridCol w:w="3260"/>
+        <w:gridCol w:w="3544"/>
+        <w:gridCol w:w="3615"/>
       </w:tblGrid>
       <w:tr>
         <w:trPr>
@@ -7049,7 +7151,7 @@
         </w:trPr>
         <w:tc>
           <w:tcPr>
-            <w:tcW w:w="1784" w:type="dxa"/>
+            <w:tcW w:w="1413" w:type="dxa"/>
             <w:shd w:val="clear" w:color="auto" w:fill="005EB8"/>
             <w:tcMar>
               <w:top w:w="70" w:type="dxa"/>
@@ -7067,22 +7169,8 @@
                 <w:sz w:val="18"/>
                 <w:szCs w:val="18"/>
               </w:rPr>
-              <w:t>Theme</w:t>
-            </w:r>
-          </w:p>
-        </w:tc>
-        <w:tc>
-          <w:tcPr>
-            <w:tcW w:w="2165" w:type="dxa"/>
-            <w:shd w:val="clear" w:color="auto" w:fill="005EB8"/>
-            <w:tcMar>
-              <w:top w:w="70" w:type="dxa"/>
-              <w:left w:w="110" w:type="dxa"/>
-              <w:bottom w:w="70" w:type="dxa"/>
-              <w:right w:w="110" w:type="dxa"/>
-            </w:tcMar>
-          </w:tcPr>
-          <w:p>
+              <w:t xml:space="preserve">Risk </w:t>
+            </w:r>
             <w:r>
               <w:rPr>
                 <w:b/>
@@ -7091,13 +7179,13 @@
                 <w:sz w:val="18"/>
                 <w:szCs w:val="18"/>
               </w:rPr>
-              <w:t>Your response</w:t>
-            </w:r>
-          </w:p>
-        </w:tc>
-        <w:tc>
-          <w:tcPr>
-            <w:tcW w:w="3827" w:type="dxa"/>
+              <w:t>Theme</w:t>
+            </w:r>
+          </w:p>
+        </w:tc>
+        <w:tc>
+          <w:tcPr>
+            <w:tcW w:w="2126" w:type="dxa"/>
             <w:shd w:val="clear" w:color="auto" w:fill="005EB8"/>
             <w:tcMar>
               <w:top w:w="70" w:type="dxa"/>
@@ -7107,6 +7195,12 @@
             </w:tcMar>
           </w:tcPr>
           <w:p>
+            <w:pPr>
+              <w:rPr>
+                <w:sz w:val="18"/>
+                <w:szCs w:val="18"/>
+              </w:rPr>
+            </w:pPr>
             <w:r>
               <w:rPr>
                 <w:b/>
@@ -7115,8 +7209,64 @@
                 <w:sz w:val="18"/>
                 <w:szCs w:val="18"/>
               </w:rPr>
-              <w:t>H</w:t>
-            </w:r>
+              <w:t>Your response</w:t>
+            </w:r>
+          </w:p>
+        </w:tc>
+        <w:tc>
+          <w:tcPr>
+            <w:tcW w:w="3260" w:type="dxa"/>
+            <w:shd w:val="clear" w:color="auto" w:fill="005EB8"/>
+            <w:tcMar>
+              <w:top w:w="70" w:type="dxa"/>
+              <w:left w:w="110" w:type="dxa"/>
+              <w:bottom w:w="70" w:type="dxa"/>
+              <w:right w:w="110" w:type="dxa"/>
+            </w:tcMar>
+          </w:tcPr>
+          <w:p>
+            <w:pPr>
+              <w:rPr>
+                <w:b/>
+                <w:bCs/>
+                <w:sz w:val="18"/>
+                <w:szCs w:val="18"/>
+              </w:rPr>
+            </w:pPr>
+            <w:r>
+              <w:rPr>
+                <w:b/>
+                <w:bCs/>
+                <w:color w:val="FFFFFF" w:themeColor="background1"/>
+                <w:sz w:val="18"/>
+                <w:szCs w:val="18"/>
+              </w:rPr>
+              <w:t>Risk</w:t>
+            </w:r>
+            <w:r>
+              <w:rPr>
+                <w:b/>
+                <w:bCs/>
+                <w:color w:val="FFFFFF" w:themeColor="background1"/>
+                <w:sz w:val="18"/>
+                <w:szCs w:val="18"/>
+              </w:rPr>
+              <w:t xml:space="preserve"> list</w:t>
+            </w:r>
+          </w:p>
+        </w:tc>
+        <w:tc>
+          <w:tcPr>
+            <w:tcW w:w="3544" w:type="dxa"/>
+            <w:shd w:val="clear" w:color="auto" w:fill="005EB8"/>
+            <w:tcMar>
+              <w:top w:w="70" w:type="dxa"/>
+              <w:left w:w="110" w:type="dxa"/>
+              <w:bottom w:w="70" w:type="dxa"/>
+              <w:right w:w="110" w:type="dxa"/>
+            </w:tcMar>
+          </w:tcPr>
+          <w:p>
             <w:r>
               <w:rPr>
                 <w:b/>
@@ -7125,22 +7275,8 @@
                 <w:sz w:val="18"/>
                 <w:szCs w:val="18"/>
               </w:rPr>
-              <w:t>azards (potential causes of harm) and related harms (adverse events caused to an individual by a hazard)</w:t>
-            </w:r>
-          </w:p>
-        </w:tc>
-        <w:tc>
-          <w:tcPr>
-            <w:tcW w:w="4590" w:type="dxa"/>
-            <w:shd w:val="clear" w:color="auto" w:fill="005EB8"/>
-            <w:tcMar>
-              <w:top w:w="70" w:type="dxa"/>
-              <w:left w:w="110" w:type="dxa"/>
-              <w:bottom w:w="70" w:type="dxa"/>
-              <w:right w:w="110" w:type="dxa"/>
-            </w:tcMar>
-          </w:tcPr>
-          <w:p>
+              <w:t>M</w:t>
+            </w:r>
             <w:r>
               <w:rPr>
                 <w:b/>
@@ -7149,7 +7285,7 @@
                 <w:sz w:val="18"/>
                 <w:szCs w:val="18"/>
               </w:rPr>
-              <w:t>Hazard m</w:t>
+              <w:t>itigation</w:t>
             </w:r>
             <w:r>
               <w:rPr>
@@ -7159,13 +7295,13 @@
                 <w:sz w:val="18"/>
                 <w:szCs w:val="18"/>
               </w:rPr>
-              <w:t>itigations</w:t>
-            </w:r>
-          </w:p>
-        </w:tc>
-        <w:tc>
-          <w:tcPr>
-            <w:tcW w:w="1592" w:type="dxa"/>
+              <w:t xml:space="preserve"> list</w:t>
+            </w:r>
+          </w:p>
+        </w:tc>
+        <w:tc>
+          <w:tcPr>
+            <w:tcW w:w="3615" w:type="dxa"/>
             <w:shd w:val="clear" w:color="auto" w:fill="005EB8"/>
             <w:tcMar>
               <w:top w:w="70" w:type="dxa"/>
@@ -7175,7 +7311,7 @@
             </w:tcMar>
           </w:tcPr>
           <w:p>
-            <w:r>
+            <w:pPr>
               <w:rPr>
                 <w:b/>
                 <w:bCs/>
@@ -7183,8 +7319,7 @@
                 <w:sz w:val="18"/>
                 <w:szCs w:val="18"/>
               </w:rPr>
-              <w:t>Highest remaining r</w:t>
-            </w:r>
+            </w:pPr>
             <w:r>
               <w:rPr>
                 <w:b/>
@@ -7193,7 +7328,60 @@
                 <w:sz w:val="18"/>
                 <w:szCs w:val="18"/>
               </w:rPr>
-              <w:t>esidual risk (likelihood of the harm occurring)</w:t>
+              <w:t xml:space="preserve">Residual risk: </w:t>
+            </w:r>
+          </w:p>
+          <w:p>
+            <w:pPr>
+              <w:rPr>
+                <w:b/>
+                <w:bCs/>
+                <w:color w:val="FFFFFF"/>
+                <w:sz w:val="18"/>
+                <w:szCs w:val="18"/>
+              </w:rPr>
+            </w:pPr>
+            <w:r>
+              <w:rPr>
+                <w:b/>
+                <w:bCs/>
+                <w:color w:val="FFFFFF"/>
+                <w:sz w:val="18"/>
+                <w:szCs w:val="18"/>
+              </w:rPr>
+              <w:t xml:space="preserve">What could still go wrong </w:t>
+            </w:r>
+            <w:r>
+              <w:rPr>
+                <w:b/>
+                <w:bCs/>
+                <w:color w:val="FFFFFF"/>
+                <w:sz w:val="18"/>
+                <w:szCs w:val="18"/>
+              </w:rPr>
+              <w:t>even with mitigations in place?</w:t>
+            </w:r>
+          </w:p>
+          <w:p>
+            <w:r>
+              <w:rPr>
+                <w:b/>
+                <w:bCs/>
+                <w:color w:val="FFFFFF"/>
+                <w:sz w:val="18"/>
+                <w:szCs w:val="18"/>
+              </w:rPr>
+              <w:t>W</w:t>
+            </w:r>
+            <w:r>
+              <w:rPr>
+                <w:b/>
+                <w:bCs/>
+                <w:color w:val="FFFFFF"/>
+                <w:sz w:val="18"/>
+                <w:szCs w:val="18"/>
+              </w:rPr>
+              <w:t>ho would be affected?</w:t>
             </w:r>
           </w:p>
         </w:tc>
@@ -7204,7 +7392,7 @@
         </w:trPr>
         <w:tc>
           <w:tcPr>
-            <w:tcW w:w="1784" w:type="dxa"/>
+            <w:tcW w:w="1413" w:type="dxa"/>
             <w:tcMar>
               <w:top w:w="70" w:type="dxa"/>
               <w:left w:w="110" w:type="dxa"/>
@@ -7229,7 +7417,7 @@
         </w:tc>
         <w:tc>
           <w:tcPr>
-            <w:tcW w:w="2165" w:type="dxa"/>
+            <w:tcW w:w="2126" w:type="dxa"/>
             <w:tcMar>
               <w:top w:w="70" w:type="dxa"/>
               <w:left w:w="110" w:type="dxa"/>
@@ -7240,6 +7428,10 @@
           <w:p>
             <w:pPr>
               <w:spacing w:after="20"/>
+              <w:rPr>
+                <w:sz w:val="16"/>
+                <w:szCs w:val="16"/>
+              </w:rPr>
             </w:pPr>
             <w:sdt>
               <w:sdtPr>
@@ -7248,7 +7440,7 @@
                   <w:sz w:val="16"/>
                   <w:szCs w:val="16"/>
                 </w:rPr>
-                <w:id w:val="5037"/>
+                <w:id w:val="-176040225"/>
                 <w14:checkbox>
                   <w14:checked w14:val="0"/>
                   <w14:checkedState w14:val="2612" w14:font="MS Gothic"/>
@@ -7279,8 +7471,20 @@
                 <w:sz w:val="16"/>
                 <w:szCs w:val="16"/>
               </w:rPr>
-              <w:t>I have amended the fields to reflect this project’s hazard profile</w:t>
-            </w:r>
+              <w:t xml:space="preserve">I have reviewed the fields to the right, and amended where necessary to reflect </w:t>
+            </w:r>
+            <w:r>
+              <w:rPr>
+                <w:sz w:val="16"/>
+                <w:szCs w:val="16"/>
+              </w:rPr>
+              <w:t>the risks of the fellow’s activity in this project</w:t>
+            </w:r>
+          </w:p>
+          <w:p>
+            <w:pPr>
+              <w:spacing w:after="20"/>
+            </w:pPr>
           </w:p>
           <w:p>
             <w:pPr>
@@ -7293,7 +7497,7 @@
                   <w:sz w:val="16"/>
                   <w:szCs w:val="16"/>
                 </w:rPr>
-                <w:id w:val="5038"/>
+                <w:id w:val="-1601240766"/>
                 <w14:checkbox>
                   <w14:checked w14:val="0"/>
                   <w14:checkedState w14:val="2612" w14:font="MS Gothic"/>
@@ -7321,16 +7525,46 @@
             </w:r>
             <w:r>
               <w:rPr>
-                <w:sz w:val="16"/>
-                <w:szCs w:val="16"/>
-              </w:rPr>
-              <w:t>Not applicable</w:t>
-            </w:r>
-          </w:p>
-        </w:tc>
-        <w:tc>
-          <w:tcPr>
-            <w:tcW w:w="3827" w:type="dxa"/>
+                <w:rFonts w:eastAsia="Segoe UI Symbol"/>
+                <w:sz w:val="16"/>
+                <w:szCs w:val="16"/>
+              </w:rPr>
+              <w:t>Hazard n</w:t>
+            </w:r>
+            <w:r>
+              <w:rPr>
+                <w:sz w:val="16"/>
+                <w:szCs w:val="16"/>
+              </w:rPr>
+              <w:t>ot applicabl</w:t>
+            </w:r>
+            <w:r>
+              <w:rPr>
+                <w:sz w:val="16"/>
+                <w:szCs w:val="16"/>
+              </w:rPr>
+              <w:t>e. Reason:</w:t>
+            </w:r>
+            <w:r>
+              <w:rPr>
+                <w:sz w:val="16"/>
+                <w:szCs w:val="16"/>
+              </w:rPr>
+              <w:t xml:space="preserve"> </w:t>
+            </w:r>
+            <w:r>
+              <w:rPr>
+                <w:color w:val="425563"/>
+                <w:sz w:val="18"/>
+                <w:szCs w:val="18"/>
+              </w:rPr>
+              <w:t>……</w:t>
+            </w:r>
+          </w:p>
+        </w:tc>
+        <w:tc>
+          <w:tcPr>
+            <w:tcW w:w="3260" w:type="dxa"/>
             <w:tcMar>
               <w:top w:w="70" w:type="dxa"/>
               <w:left w:w="110" w:type="dxa"/>
@@ -7346,9 +7580,13 @@
                 <w:numId w:val="2"/>
               </w:numPr>
               <w:spacing w:after="20" w:line="230" w:lineRule="auto"/>
-            </w:pPr>
-            <w:r>
-              <w:rPr>
+              <w:rPr>
+                <w:color w:val="808080" w:themeColor="background1" w:themeShade="80"/>
+              </w:rPr>
+            </w:pPr>
+            <w:r>
+              <w:rPr>
+                <w:color w:val="808080" w:themeColor="background1" w:themeShade="80"/>
                 <w:sz w:val="16"/>
                 <w:szCs w:val="16"/>
               </w:rPr>
@@ -7363,9 +7601,13 @@
                 <w:numId w:val="2"/>
               </w:numPr>
               <w:spacing w:after="20" w:line="230" w:lineRule="auto"/>
-            </w:pPr>
-            <w:r>
-              <w:rPr>
+              <w:rPr>
+                <w:color w:val="808080" w:themeColor="background1" w:themeShade="80"/>
+              </w:rPr>
+            </w:pPr>
+            <w:r>
+              <w:rPr>
+                <w:color w:val="808080" w:themeColor="background1" w:themeShade="80"/>
                 <w:sz w:val="16"/>
                 <w:szCs w:val="16"/>
               </w:rPr>
@@ -7374,6 +7616,7 @@
             <w:proofErr w:type="gramStart"/>
             <w:r>
               <w:rPr>
+                <w:color w:val="808080" w:themeColor="background1" w:themeShade="80"/>
                 <w:sz w:val="16"/>
                 <w:szCs w:val="16"/>
               </w:rPr>
@@ -7382,6 +7625,7 @@
             <w:proofErr w:type="gramEnd"/>
             <w:r>
               <w:rPr>
+                <w:color w:val="808080" w:themeColor="background1" w:themeShade="80"/>
                 <w:sz w:val="16"/>
                 <w:szCs w:val="16"/>
               </w:rPr>
@@ -7399,6 +7643,7 @@
             </w:pPr>
             <w:r>
               <w:rPr>
+                <w:color w:val="808080" w:themeColor="background1" w:themeShade="80"/>
                 <w:sz w:val="16"/>
                 <w:szCs w:val="16"/>
               </w:rPr>
@@ -7408,7 +7653,7 @@
         </w:tc>
         <w:tc>
           <w:tcPr>
-            <w:tcW w:w="4590" w:type="dxa"/>
+            <w:tcW w:w="3544" w:type="dxa"/>
             <w:tcMar>
               <w:top w:w="70" w:type="dxa"/>
               <w:left w:w="110" w:type="dxa"/>
@@ -7424,9 +7669,13 @@
                 <w:numId w:val="2"/>
               </w:numPr>
               <w:spacing w:after="20" w:line="230" w:lineRule="auto"/>
-            </w:pPr>
-            <w:r>
-              <w:rPr>
+              <w:rPr>
+                <w:color w:val="808080" w:themeColor="background1" w:themeShade="80"/>
+              </w:rPr>
+            </w:pPr>
+            <w:r>
+              <w:rPr>
+                <w:color w:val="808080" w:themeColor="background1" w:themeShade="80"/>
                 <w:sz w:val="16"/>
                 <w:szCs w:val="16"/>
               </w:rPr>
@@ -7441,9 +7690,13 @@
                 <w:numId w:val="2"/>
               </w:numPr>
               <w:spacing w:after="20" w:line="230" w:lineRule="auto"/>
-            </w:pPr>
-            <w:r>
-              <w:rPr>
+              <w:rPr>
+                <w:color w:val="808080" w:themeColor="background1" w:themeShade="80"/>
+              </w:rPr>
+            </w:pPr>
+            <w:r>
+              <w:rPr>
+                <w:color w:val="808080" w:themeColor="background1" w:themeShade="80"/>
                 <w:sz w:val="16"/>
                 <w:szCs w:val="16"/>
               </w:rPr>
@@ -7458,9 +7711,13 @@
                 <w:numId w:val="2"/>
               </w:numPr>
               <w:spacing w:after="20" w:line="230" w:lineRule="auto"/>
-            </w:pPr>
-            <w:r>
-              <w:rPr>
+              <w:rPr>
+                <w:color w:val="808080" w:themeColor="background1" w:themeShade="80"/>
+              </w:rPr>
+            </w:pPr>
+            <w:r>
+              <w:rPr>
+                <w:color w:val="808080" w:themeColor="background1" w:themeShade="80"/>
                 <w:sz w:val="16"/>
                 <w:szCs w:val="16"/>
               </w:rPr>
@@ -7478,6 +7735,7 @@
             </w:pPr>
             <w:r>
               <w:rPr>
+                <w:color w:val="808080" w:themeColor="background1" w:themeShade="80"/>
                 <w:sz w:val="16"/>
                 <w:szCs w:val="16"/>
               </w:rPr>
@@ -7487,7 +7745,7 @@
         </w:tc>
         <w:tc>
           <w:tcPr>
-            <w:tcW w:w="1592" w:type="dxa"/>
+            <w:tcW w:w="3615" w:type="dxa"/>
             <w:tcMar>
               <w:top w:w="70" w:type="dxa"/>
               <w:left w:w="110" w:type="dxa"/>
@@ -7537,7 +7795,7 @@
                 <w:sz w:val="16"/>
                 <w:szCs w:val="16"/>
               </w:rPr>
-              <w:t>Low</w:t>
+              <w:t>Nothing significant</w:t>
             </w:r>
           </w:p>
           <w:p>
@@ -7579,10 +7837,11 @@
             </w:r>
             <w:r>
               <w:rPr>
-                <w:sz w:val="16"/>
-                <w:szCs w:val="16"/>
-              </w:rPr>
-              <w:t>High</w:t>
+                <w:rFonts w:eastAsia="Segoe UI Symbol"/>
+                <w:sz w:val="16"/>
+                <w:szCs w:val="16"/>
+              </w:rPr>
+              <w:t>Residual risk following mitigation: ……</w:t>
             </w:r>
           </w:p>
         </w:tc>
@@ -7593,7 +7852,7 @@
         </w:trPr>
         <w:tc>
           <w:tcPr>
-            <w:tcW w:w="1784" w:type="dxa"/>
+            <w:tcW w:w="1413" w:type="dxa"/>
             <w:tcMar>
               <w:top w:w="70" w:type="dxa"/>
               <w:left w:w="110" w:type="dxa"/>
@@ -7619,7 +7878,7 @@
         </w:tc>
         <w:tc>
           <w:tcPr>
-            <w:tcW w:w="2165" w:type="dxa"/>
+            <w:tcW w:w="2126" w:type="dxa"/>
             <w:tcMar>
               <w:top w:w="70" w:type="dxa"/>
               <w:left w:w="110" w:type="dxa"/>
@@ -7630,6 +7889,10 @@
           <w:p>
             <w:pPr>
               <w:spacing w:after="20"/>
+              <w:rPr>
+                <w:sz w:val="16"/>
+                <w:szCs w:val="16"/>
+              </w:rPr>
             </w:pPr>
             <w:sdt>
               <w:sdtPr>
@@ -7638,7 +7901,7 @@
                   <w:sz w:val="16"/>
                   <w:szCs w:val="16"/>
                 </w:rPr>
-                <w:id w:val="-493491444"/>
+                <w:id w:val="-348248272"/>
                 <w14:checkbox>
                   <w14:checked w14:val="0"/>
                   <w14:checkedState w14:val="2612" w14:font="MS Gothic"/>
@@ -7669,8 +7932,13 @@
                 <w:sz w:val="16"/>
                 <w:szCs w:val="16"/>
               </w:rPr>
-              <w:t>I have amended the fields to reflect this project’s hazard profile</w:t>
-            </w:r>
+              <w:t>I have reviewed the fields to the right, and amended where necessary to reflect the risks of the fellow’s activity in this project</w:t>
+            </w:r>
+          </w:p>
+          <w:p>
+            <w:pPr>
+              <w:spacing w:after="20"/>
+            </w:pPr>
           </w:p>
           <w:p>
             <w:pPr>
@@ -7683,7 +7951,7 @@
                   <w:sz w:val="16"/>
                   <w:szCs w:val="16"/>
                 </w:rPr>
-                <w:id w:val="-1693914496"/>
+                <w:id w:val="-1668630475"/>
                 <w14:checkbox>
                   <w14:checked w14:val="0"/>
                   <w14:checkedState w14:val="2612" w14:font="MS Gothic"/>
@@ -7711,16 +7979,39 @@
             </w:r>
             <w:r>
               <w:rPr>
-                <w:sz w:val="16"/>
-                <w:szCs w:val="16"/>
-              </w:rPr>
-              <w:t>Not applicable</w:t>
-            </w:r>
-          </w:p>
-        </w:tc>
-        <w:tc>
-          <w:tcPr>
-            <w:tcW w:w="3827" w:type="dxa"/>
+                <w:rFonts w:eastAsia="Segoe UI Symbol"/>
+                <w:sz w:val="16"/>
+                <w:szCs w:val="16"/>
+              </w:rPr>
+              <w:t>Hazard n</w:t>
+            </w:r>
+            <w:r>
+              <w:rPr>
+                <w:sz w:val="16"/>
+                <w:szCs w:val="16"/>
+              </w:rPr>
+              <w:t>ot applicabl</w:t>
+            </w:r>
+            <w:r>
+              <w:rPr>
+                <w:sz w:val="16"/>
+                <w:szCs w:val="16"/>
+              </w:rPr>
+              <w:t xml:space="preserve">e. Reason: </w:t>
+            </w:r>
+            <w:r>
+              <w:rPr>
+                <w:color w:val="425563"/>
+                <w:sz w:val="18"/>
+                <w:szCs w:val="18"/>
+              </w:rPr>
+              <w:t>……</w:t>
+            </w:r>
+          </w:p>
+        </w:tc>
+        <w:tc>
+          <w:tcPr>
+            <w:tcW w:w="3260" w:type="dxa"/>
             <w:tcMar>
               <w:top w:w="70" w:type="dxa"/>
               <w:left w:w="110" w:type="dxa"/>
@@ -7736,9 +8027,13 @@
                 <w:numId w:val="2"/>
               </w:numPr>
               <w:spacing w:after="20" w:line="230" w:lineRule="auto"/>
-            </w:pPr>
-            <w:r>
-              <w:rPr>
+              <w:rPr>
+                <w:color w:val="808080" w:themeColor="background1" w:themeShade="80"/>
+              </w:rPr>
+            </w:pPr>
+            <w:r>
+              <w:rPr>
+                <w:color w:val="808080" w:themeColor="background1" w:themeShade="80"/>
                 <w:sz w:val="16"/>
                 <w:szCs w:val="16"/>
               </w:rPr>
@@ -7753,9 +8048,13 @@
                 <w:numId w:val="2"/>
               </w:numPr>
               <w:spacing w:after="20" w:line="230" w:lineRule="auto"/>
-            </w:pPr>
-            <w:r>
-              <w:rPr>
+              <w:rPr>
+                <w:color w:val="808080" w:themeColor="background1" w:themeShade="80"/>
+              </w:rPr>
+            </w:pPr>
+            <w:r>
+              <w:rPr>
+                <w:color w:val="808080" w:themeColor="background1" w:themeShade="80"/>
                 <w:sz w:val="16"/>
                 <w:szCs w:val="16"/>
               </w:rPr>
@@ -7770,9 +8069,13 @@
                 <w:numId w:val="2"/>
               </w:numPr>
               <w:spacing w:after="20" w:line="230" w:lineRule="auto"/>
-            </w:pPr>
-            <w:r>
-              <w:rPr>
+              <w:rPr>
+                <w:color w:val="808080" w:themeColor="background1" w:themeShade="80"/>
+              </w:rPr>
+            </w:pPr>
+            <w:r>
+              <w:rPr>
+                <w:color w:val="808080" w:themeColor="background1" w:themeShade="80"/>
                 <w:sz w:val="16"/>
                 <w:szCs w:val="16"/>
               </w:rPr>
@@ -7781,6 +8084,7 @@
             <w:proofErr w:type="gramStart"/>
             <w:r>
               <w:rPr>
+                <w:color w:val="808080" w:themeColor="background1" w:themeShade="80"/>
                 <w:sz w:val="16"/>
                 <w:szCs w:val="16"/>
               </w:rPr>
@@ -7789,6 +8093,7 @@
             <w:proofErr w:type="gramEnd"/>
             <w:r>
               <w:rPr>
+                <w:color w:val="808080" w:themeColor="background1" w:themeShade="80"/>
                 <w:sz w:val="16"/>
                 <w:szCs w:val="16"/>
               </w:rPr>
@@ -7803,9 +8108,13 @@
                 <w:numId w:val="2"/>
               </w:numPr>
               <w:spacing w:after="0" w:line="230" w:lineRule="auto"/>
-            </w:pPr>
-            <w:r>
-              <w:rPr>
+              <w:rPr>
+                <w:color w:val="808080" w:themeColor="background1" w:themeShade="80"/>
+              </w:rPr>
+            </w:pPr>
+            <w:r>
+              <w:rPr>
+                <w:color w:val="808080" w:themeColor="background1" w:themeShade="80"/>
                 <w:sz w:val="16"/>
                 <w:szCs w:val="16"/>
               </w:rPr>
@@ -7815,7 +8124,7 @@
         </w:tc>
         <w:tc>
           <w:tcPr>
-            <w:tcW w:w="4590" w:type="dxa"/>
+            <w:tcW w:w="3544" w:type="dxa"/>
             <w:tcMar>
               <w:top w:w="70" w:type="dxa"/>
               <w:left w:w="110" w:type="dxa"/>
@@ -7831,9 +8140,13 @@
                 <w:numId w:val="2"/>
               </w:numPr>
               <w:spacing w:after="20" w:line="230" w:lineRule="auto"/>
-            </w:pPr>
-            <w:r>
-              <w:rPr>
+              <w:rPr>
+                <w:color w:val="808080" w:themeColor="background1" w:themeShade="80"/>
+              </w:rPr>
+            </w:pPr>
+            <w:r>
+              <w:rPr>
+                <w:color w:val="808080" w:themeColor="background1" w:themeShade="80"/>
                 <w:sz w:val="16"/>
                 <w:szCs w:val="16"/>
               </w:rPr>
@@ -7848,9 +8161,13 @@
                 <w:numId w:val="2"/>
               </w:numPr>
               <w:spacing w:after="20" w:line="230" w:lineRule="auto"/>
-            </w:pPr>
-            <w:r>
-              <w:rPr>
+              <w:rPr>
+                <w:color w:val="808080" w:themeColor="background1" w:themeShade="80"/>
+              </w:rPr>
+            </w:pPr>
+            <w:r>
+              <w:rPr>
+                <w:color w:val="808080" w:themeColor="background1" w:themeShade="80"/>
                 <w:sz w:val="16"/>
                 <w:szCs w:val="16"/>
               </w:rPr>
@@ -7865,9 +8182,13 @@
                 <w:numId w:val="2"/>
               </w:numPr>
               <w:spacing w:after="20" w:line="230" w:lineRule="auto"/>
-            </w:pPr>
-            <w:r>
-              <w:rPr>
+              <w:rPr>
+                <w:color w:val="808080" w:themeColor="background1" w:themeShade="80"/>
+              </w:rPr>
+            </w:pPr>
+            <w:r>
+              <w:rPr>
+                <w:color w:val="808080" w:themeColor="background1" w:themeShade="80"/>
                 <w:sz w:val="16"/>
                 <w:szCs w:val="16"/>
               </w:rPr>
@@ -7876,6 +8197,7 @@
             <w:proofErr w:type="gramStart"/>
             <w:r>
               <w:rPr>
+                <w:color w:val="808080" w:themeColor="background1" w:themeShade="80"/>
                 <w:sz w:val="16"/>
                 <w:szCs w:val="16"/>
               </w:rPr>
@@ -7884,6 +8206,7 @@
             <w:proofErr w:type="gramEnd"/>
             <w:r>
               <w:rPr>
+                <w:color w:val="808080" w:themeColor="background1" w:themeShade="80"/>
                 <w:sz w:val="16"/>
                 <w:szCs w:val="16"/>
               </w:rPr>
@@ -7898,9 +8221,13 @@
                 <w:numId w:val="2"/>
               </w:numPr>
               <w:spacing w:after="20" w:line="230" w:lineRule="auto"/>
-            </w:pPr>
-            <w:r>
-              <w:rPr>
+              <w:rPr>
+                <w:color w:val="808080" w:themeColor="background1" w:themeShade="80"/>
+              </w:rPr>
+            </w:pPr>
+            <w:r>
+              <w:rPr>
+                <w:color w:val="808080" w:themeColor="background1" w:themeShade="80"/>
                 <w:sz w:val="16"/>
                 <w:szCs w:val="16"/>
               </w:rPr>
@@ -7915,9 +8242,13 @@
                 <w:numId w:val="2"/>
               </w:numPr>
               <w:spacing w:after="0" w:line="230" w:lineRule="auto"/>
-            </w:pPr>
-            <w:r>
-              <w:rPr>
+              <w:rPr>
+                <w:color w:val="808080" w:themeColor="background1" w:themeShade="80"/>
+              </w:rPr>
+            </w:pPr>
+            <w:r>
+              <w:rPr>
+                <w:color w:val="808080" w:themeColor="background1" w:themeShade="80"/>
                 <w:sz w:val="16"/>
                 <w:szCs w:val="16"/>
               </w:rPr>
@@ -7927,7 +8258,7 @@
         </w:tc>
         <w:tc>
           <w:tcPr>
-            <w:tcW w:w="1592" w:type="dxa"/>
+            <w:tcW w:w="3615" w:type="dxa"/>
             <w:tcMar>
               <w:top w:w="70" w:type="dxa"/>
               <w:left w:w="110" w:type="dxa"/>
@@ -7946,7 +8277,52 @@
                   <w:sz w:val="16"/>
                   <w:szCs w:val="16"/>
                 </w:rPr>
-                <w:id w:val="5044"/>
+                <w:id w:val="790329523"/>
+                <w14:checkbox>
+                  <w14:checked w14:val="0"/>
+                  <w14:checkedState w14:val="2612" w14:font="MS Gothic"/>
+                  <w14:uncheckedState w14:val="2610" w14:font="MS Gothic"/>
+                </w14:checkbox>
+              </w:sdtPr>
+              <w:sdtContent>
+                <w:r>
+                  <w:rPr>
+                    <w:rFonts w:ascii="MS Gothic" w:eastAsia="MS Gothic" w:hAnsi="MS Gothic" w:hint="eastAsia"/>
+                    <w:sz w:val="16"/>
+                    <w:szCs w:val="16"/>
+                  </w:rPr>
+                  <w:t>☐</w:t>
+                </w:r>
+              </w:sdtContent>
+            </w:sdt>
+            <w:r>
+              <w:rPr>
+                <w:rFonts w:eastAsia="Segoe UI Symbol"/>
+                <w:sz w:val="16"/>
+                <w:szCs w:val="16"/>
+              </w:rPr>
+              <w:t xml:space="preserve">  </w:t>
+            </w:r>
+            <w:r>
+              <w:rPr>
+                <w:sz w:val="16"/>
+                <w:szCs w:val="16"/>
+              </w:rPr>
+              <w:t>Nothing significant</w:t>
+            </w:r>
+          </w:p>
+          <w:p>
+            <w:pPr>
+              <w:spacing w:after="0"/>
+            </w:pPr>
+            <w:sdt>
+              <w:sdtPr>
+                <w:rPr>
+                  <w:rFonts w:eastAsia="MS Gothic"/>
+                  <w:sz w:val="16"/>
+                  <w:szCs w:val="16"/>
+                </w:rPr>
+                <w:id w:val="-1128089698"/>
                 <w14:checkbox>
                   <w14:checked w14:val="0"/>
                   <w14:checkedState w14:val="2612" w14:font="MS Gothic"/>
@@ -7974,15 +8350,61 @@
             </w:r>
             <w:r>
               <w:rPr>
-                <w:sz w:val="16"/>
-                <w:szCs w:val="16"/>
-              </w:rPr>
-              <w:t>Low</w:t>
-            </w:r>
-          </w:p>
+                <w:rFonts w:eastAsia="Segoe UI Symbol"/>
+                <w:sz w:val="16"/>
+                <w:szCs w:val="16"/>
+              </w:rPr>
+              <w:t>Residual risk following mitigation: ……</w:t>
+            </w:r>
+          </w:p>
+        </w:tc>
+      </w:tr>
+      <w:tr>
+        <w:trPr>
+          <w:cantSplit/>
+        </w:trPr>
+        <w:tc>
+          <w:tcPr>
+            <w:tcW w:w="1413" w:type="dxa"/>
+            <w:tcMar>
+              <w:top w:w="70" w:type="dxa"/>
+              <w:left w:w="110" w:type="dxa"/>
+              <w:bottom w:w="70" w:type="dxa"/>
+              <w:right w:w="110" w:type="dxa"/>
+            </w:tcMar>
+          </w:tcPr>
           <w:p>
             <w:pPr>
               <w:spacing w:after="0"/>
+            </w:pPr>
+            <w:r>
+              <w:rPr>
+                <w:b/>
+                <w:bCs/>
+                <w:sz w:val="18"/>
+                <w:szCs w:val="18"/>
+              </w:rPr>
+              <w:t>Legal and ethical standards</w:t>
+            </w:r>
+          </w:p>
+        </w:tc>
+        <w:tc>
+          <w:tcPr>
+            <w:tcW w:w="2126" w:type="dxa"/>
+            <w:tcMar>
+              <w:top w:w="70" w:type="dxa"/>
+              <w:left w:w="110" w:type="dxa"/>
+              <w:bottom w:w="70" w:type="dxa"/>
+              <w:right w:w="110" w:type="dxa"/>
+            </w:tcMar>
+          </w:tcPr>
+          <w:p>
+            <w:pPr>
+              <w:spacing w:after="20"/>
+              <w:rPr>
+                <w:sz w:val="16"/>
+                <w:szCs w:val="16"/>
+              </w:rPr>
             </w:pPr>
             <w:sdt>
               <w:sdtPr>
@@ -7991,7 +8413,7 @@
                   <w:sz w:val="16"/>
                   <w:szCs w:val="16"/>
                 </w:rPr>
-                <w:id w:val="5045"/>
+                <w:id w:val="-1186592380"/>
                 <w14:checkbox>
                   <w14:checked w14:val="0"/>
                   <w14:checkedState w14:val="2612" w14:font="MS Gothic"/>
@@ -8015,60 +8437,24 @@
                 <w:sz w:val="16"/>
                 <w:szCs w:val="16"/>
               </w:rPr>
-              <w:t xml:space="preserve">  </w:t>
-            </w:r>
-            <w:r>
-              <w:rPr>
-                <w:sz w:val="16"/>
-                <w:szCs w:val="16"/>
-              </w:rPr>
-              <w:t>High</w:t>
-            </w:r>
-          </w:p>
-        </w:tc>
-      </w:tr>
-      <w:tr>
-        <w:trPr>
-          <w:cantSplit/>
-        </w:trPr>
-        <w:tc>
-          <w:tcPr>
-            <w:tcW w:w="1784" w:type="dxa"/>
-            <w:tcMar>
-              <w:top w:w="70" w:type="dxa"/>
-              <w:left w:w="110" w:type="dxa"/>
-              <w:bottom w:w="70" w:type="dxa"/>
-              <w:right w:w="110" w:type="dxa"/>
-            </w:tcMar>
-          </w:tcPr>
+              <w:t xml:space="preserve"> </w:t>
+            </w:r>
+            <w:r>
+              <w:rPr>
+                <w:sz w:val="16"/>
+                <w:szCs w:val="16"/>
+              </w:rPr>
+              <w:t>I have reviewed the fields to the right, and amended where necessary to reflect the risks of the fellow’s activity in this project</w:t>
+            </w:r>
+          </w:p>
+          <w:p>
+            <w:pPr>
+              <w:spacing w:after="20"/>
+            </w:pPr>
+          </w:p>
           <w:p>
             <w:pPr>
               <w:spacing w:after="0"/>
-            </w:pPr>
-            <w:r>
-              <w:rPr>
-                <w:b/>
-                <w:bCs/>
-                <w:sz w:val="18"/>
-                <w:szCs w:val="18"/>
-              </w:rPr>
-              <w:t>Legal and ethical standards</w:t>
-            </w:r>
-          </w:p>
-        </w:tc>
-        <w:tc>
-          <w:tcPr>
-            <w:tcW w:w="2165" w:type="dxa"/>
-            <w:tcMar>
-              <w:top w:w="70" w:type="dxa"/>
-              <w:left w:w="110" w:type="dxa"/>
-              <w:bottom w:w="70" w:type="dxa"/>
-              <w:right w:w="110" w:type="dxa"/>
-            </w:tcMar>
-          </w:tcPr>
-          <w:p>
-            <w:pPr>
-              <w:spacing w:after="20"/>
             </w:pPr>
             <w:sdt>
               <w:sdtPr>
@@ -8077,7 +8463,255 @@
                   <w:sz w:val="16"/>
                   <w:szCs w:val="16"/>
                 </w:rPr>
-                <w:id w:val="451138092"/>
+                <w:id w:val="1384912574"/>
+                <w14:checkbox>
+                  <w14:checked w14:val="0"/>
+                  <w14:checkedState w14:val="2612" w14:font="MS Gothic"/>
+                  <w14:uncheckedState w14:val="2610" w14:font="MS Gothic"/>
+                </w14:checkbox>
+              </w:sdtPr>
+              <w:sdtContent>
+                <w:r>
+                  <w:rPr>
+                    <w:rFonts w:ascii="Segoe UI Symbol" w:eastAsia="MS Gothic" w:hAnsi="Segoe UI Symbol" w:cs="Segoe UI Symbol"/>
+                    <w:sz w:val="16"/>
+                    <w:szCs w:val="16"/>
+                  </w:rPr>
+                  <w:t>☐</w:t>
+                </w:r>
+              </w:sdtContent>
+            </w:sdt>
+            <w:r>
+              <w:rPr>
+                <w:rFonts w:eastAsia="Segoe UI Symbol"/>
+                <w:sz w:val="16"/>
+                <w:szCs w:val="16"/>
+              </w:rPr>
+              <w:t xml:space="preserve"> </w:t>
+            </w:r>
+            <w:r>
+              <w:rPr>
+                <w:rFonts w:eastAsia="Segoe UI Symbol"/>
+                <w:sz w:val="16"/>
+                <w:szCs w:val="16"/>
+              </w:rPr>
+              <w:t>Hazard n</w:t>
+            </w:r>
+            <w:r>
+              <w:rPr>
+                <w:sz w:val="16"/>
+                <w:szCs w:val="16"/>
+              </w:rPr>
+              <w:t>ot applicabl</w:t>
+            </w:r>
+            <w:r>
+              <w:rPr>
+                <w:sz w:val="16"/>
+                <w:szCs w:val="16"/>
+              </w:rPr>
+              <w:t xml:space="preserve">e. Reason: </w:t>
+            </w:r>
+            <w:r>
+              <w:rPr>
+                <w:color w:val="425563"/>
+                <w:sz w:val="18"/>
+                <w:szCs w:val="18"/>
+              </w:rPr>
+              <w:t>……</w:t>
+            </w:r>
+          </w:p>
+        </w:tc>
+        <w:tc>
+          <w:tcPr>
+            <w:tcW w:w="3260" w:type="dxa"/>
+            <w:tcMar>
+              <w:top w:w="70" w:type="dxa"/>
+              <w:left w:w="110" w:type="dxa"/>
+              <w:bottom w:w="70" w:type="dxa"/>
+              <w:right w:w="110" w:type="dxa"/>
+            </w:tcMar>
+          </w:tcPr>
+          <w:p>
+            <w:pPr>
+              <w:pStyle w:val="ListParagraph"/>
+              <w:numPr>
+                <w:ilvl w:val="0"/>
+                <w:numId w:val="2"/>
+              </w:numPr>
+              <w:spacing w:after="20" w:line="230" w:lineRule="auto"/>
+              <w:rPr>
+                <w:color w:val="808080" w:themeColor="background1" w:themeShade="80"/>
+              </w:rPr>
+            </w:pPr>
+            <w:r>
+              <w:rPr>
+                <w:color w:val="808080" w:themeColor="background1" w:themeShade="80"/>
+                <w:sz w:val="16"/>
+                <w:szCs w:val="16"/>
+              </w:rPr>
+              <w:t>Work proceeds without the correct research or service-evaluation approvals.</w:t>
+            </w:r>
+          </w:p>
+          <w:p>
+            <w:pPr>
+              <w:pStyle w:val="ListParagraph"/>
+              <w:numPr>
+                <w:ilvl w:val="0"/>
+                <w:numId w:val="2"/>
+              </w:numPr>
+              <w:spacing w:after="20" w:line="230" w:lineRule="auto"/>
+              <w:rPr>
+                <w:color w:val="808080" w:themeColor="background1" w:themeShade="80"/>
+              </w:rPr>
+            </w:pPr>
+            <w:r>
+              <w:rPr>
+                <w:color w:val="808080" w:themeColor="background1" w:themeShade="80"/>
+                <w:sz w:val="16"/>
+                <w:szCs w:val="16"/>
+              </w:rPr>
+              <w:t>Uncertain medical device classification for a tool that influences care (CE/UKCA).</w:t>
+            </w:r>
+          </w:p>
+          <w:p>
+            <w:pPr>
+              <w:pStyle w:val="ListParagraph"/>
+              <w:numPr>
+                <w:ilvl w:val="0"/>
+                <w:numId w:val="2"/>
+              </w:numPr>
+              <w:spacing w:after="20" w:line="230" w:lineRule="auto"/>
+              <w:rPr>
+                <w:color w:val="808080" w:themeColor="background1" w:themeShade="80"/>
+              </w:rPr>
+            </w:pPr>
+            <w:r>
+              <w:rPr>
+                <w:color w:val="808080" w:themeColor="background1" w:themeShade="80"/>
+                <w:sz w:val="16"/>
+                <w:szCs w:val="16"/>
+              </w:rPr>
+              <w:t>Model performs inequitably across patient groups, or accountability for a clinical decision becomes unclear.</w:t>
+            </w:r>
+          </w:p>
+        </w:tc>
+        <w:tc>
+          <w:tcPr>
+            <w:tcW w:w="3544" w:type="dxa"/>
+            <w:tcMar>
+              <w:top w:w="70" w:type="dxa"/>
+              <w:left w:w="110" w:type="dxa"/>
+              <w:bottom w:w="70" w:type="dxa"/>
+              <w:right w:w="110" w:type="dxa"/>
+            </w:tcMar>
+          </w:tcPr>
+          <w:p>
+            <w:pPr>
+              <w:pStyle w:val="ListParagraph"/>
+              <w:numPr>
+                <w:ilvl w:val="0"/>
+                <w:numId w:val="2"/>
+              </w:numPr>
+              <w:spacing w:after="20" w:line="230" w:lineRule="auto"/>
+              <w:rPr>
+                <w:color w:val="808080" w:themeColor="background1" w:themeShade="80"/>
+              </w:rPr>
+            </w:pPr>
+            <w:r>
+              <w:rPr>
+                <w:color w:val="808080" w:themeColor="background1" w:themeShade="80"/>
+                <w:sz w:val="16"/>
+                <w:szCs w:val="16"/>
+              </w:rPr>
+              <w:t>HRA decision tool applied at the outset; approvals confirmed in writing before the relevant work begins.</w:t>
+            </w:r>
+          </w:p>
+          <w:p>
+            <w:pPr>
+              <w:pStyle w:val="ListParagraph"/>
+              <w:numPr>
+                <w:ilvl w:val="0"/>
+                <w:numId w:val="2"/>
+              </w:numPr>
+              <w:spacing w:after="20" w:line="230" w:lineRule="auto"/>
+              <w:rPr>
+                <w:color w:val="808080" w:themeColor="background1" w:themeShade="80"/>
+              </w:rPr>
+            </w:pPr>
+            <w:r>
+              <w:rPr>
+                <w:color w:val="808080" w:themeColor="background1" w:themeShade="80"/>
+                <w:sz w:val="16"/>
+                <w:szCs w:val="16"/>
+              </w:rPr>
+              <w:t>Regulatory classification confirmed with the Trust medical device / clinical safety team.</w:t>
+            </w:r>
+          </w:p>
+          <w:p>
+            <w:pPr>
+              <w:pStyle w:val="ListParagraph"/>
+              <w:numPr>
+                <w:ilvl w:val="0"/>
+                <w:numId w:val="2"/>
+              </w:numPr>
+              <w:spacing w:after="20" w:line="230" w:lineRule="auto"/>
+              <w:rPr>
+                <w:color w:val="808080" w:themeColor="background1" w:themeShade="80"/>
+              </w:rPr>
+            </w:pPr>
+            <w:r>
+              <w:rPr>
+                <w:color w:val="808080" w:themeColor="background1" w:themeShade="80"/>
+                <w:sz w:val="16"/>
+                <w:szCs w:val="16"/>
+              </w:rPr>
+              <w:t>Subgroup performance and bias assessment included in the evaluation plan.</w:t>
+            </w:r>
+          </w:p>
+          <w:p>
+            <w:pPr>
+              <w:pStyle w:val="ListParagraph"/>
+              <w:numPr>
+                <w:ilvl w:val="0"/>
+                <w:numId w:val="2"/>
+              </w:numPr>
+              <w:spacing w:after="20" w:line="230" w:lineRule="auto"/>
+              <w:rPr>
+                <w:color w:val="808080" w:themeColor="background1" w:themeShade="80"/>
+              </w:rPr>
+            </w:pPr>
+            <w:r>
+              <w:rPr>
+                <w:color w:val="808080" w:themeColor="background1" w:themeShade="80"/>
+                <w:sz w:val="16"/>
+                <w:szCs w:val="16"/>
+              </w:rPr>
+              <w:t>Accountability for every clinical decision remains with a registered clinician; documented in the project plan.</w:t>
+            </w:r>
+          </w:p>
+        </w:tc>
+        <w:tc>
+          <w:tcPr>
+            <w:tcW w:w="3615" w:type="dxa"/>
+            <w:tcMar>
+              <w:top w:w="70" w:type="dxa"/>
+              <w:left w:w="110" w:type="dxa"/>
+              <w:bottom w:w="70" w:type="dxa"/>
+              <w:right w:w="110" w:type="dxa"/>
+            </w:tcMar>
+          </w:tcPr>
+          <w:p>
+            <w:pPr>
+              <w:spacing w:after="20"/>
+            </w:pPr>
+            <w:sdt>
+              <w:sdtPr>
+                <w:rPr>
+                  <w:rFonts w:eastAsia="MS Gothic"/>
+                  <w:sz w:val="16"/>
+                  <w:szCs w:val="16"/>
+                </w:rPr>
+                <w:id w:val="-1366833489"/>
                 <w14:checkbox>
                   <w14:checked w14:val="0"/>
                   <w14:checkedState w14:val="2612" w14:font="MS Gothic"/>
@@ -8101,14 +8735,14 @@
                 <w:sz w:val="16"/>
                 <w:szCs w:val="16"/>
               </w:rPr>
-              <w:t xml:space="preserve"> </w:t>
-            </w:r>
-            <w:r>
-              <w:rPr>
-                <w:sz w:val="16"/>
-                <w:szCs w:val="16"/>
-              </w:rPr>
-              <w:t>I have amended the fields to reflect this project’s hazard profile</w:t>
+              <w:t xml:space="preserve">  </w:t>
+            </w:r>
+            <w:r>
+              <w:rPr>
+                <w:sz w:val="16"/>
+                <w:szCs w:val="16"/>
+              </w:rPr>
+              <w:t>Nothing significant</w:t>
             </w:r>
           </w:p>
           <w:p>
@@ -8122,7 +8756,7 @@
                   <w:sz w:val="16"/>
                   <w:szCs w:val="16"/>
                 </w:rPr>
-                <w:id w:val="143239626"/>
+                <w:id w:val="-1718892125"/>
                 <w14:checkbox>
                   <w14:checked w14:val="0"/>
                   <w14:checkedState w14:val="2612" w14:font="MS Gothic"/>
@@ -8146,20 +8780,26 @@
                 <w:sz w:val="16"/>
                 <w:szCs w:val="16"/>
               </w:rPr>
-              <w:t xml:space="preserve"> </w:t>
-            </w:r>
-            <w:r>
-              <w:rPr>
-                <w:sz w:val="16"/>
-                <w:szCs w:val="16"/>
-              </w:rPr>
-              <w:t>Not applicable</w:t>
-            </w:r>
-          </w:p>
-        </w:tc>
-        <w:tc>
-          <w:tcPr>
-            <w:tcW w:w="3827" w:type="dxa"/>
+              <w:t xml:space="preserve">  </w:t>
+            </w:r>
+            <w:r>
+              <w:rPr>
+                <w:rFonts w:eastAsia="Segoe UI Symbol"/>
+                <w:sz w:val="16"/>
+                <w:szCs w:val="16"/>
+              </w:rPr>
+              <w:t>Residual risk following mitigation: ……</w:t>
+            </w:r>
+          </w:p>
+        </w:tc>
+      </w:tr>
+      <w:tr>
+        <w:trPr>
+          <w:cantSplit/>
+        </w:trPr>
+        <w:tc>
+          <w:tcPr>
+            <w:tcW w:w="1413" w:type="dxa"/>
             <w:tcMar>
               <w:top w:w="70" w:type="dxa"/>
               <w:left w:w="110" w:type="dxa"/>
@@ -8169,59 +8809,23 @@
           </w:tcPr>
           <w:p>
             <w:pPr>
-              <w:pStyle w:val="ListParagraph"/>
-              <w:numPr>
-                <w:ilvl w:val="0"/>
-                <w:numId w:val="2"/>
-              </w:numPr>
-              <w:spacing w:after="20" w:line="230" w:lineRule="auto"/>
-            </w:pPr>
-            <w:r>
-              <w:rPr>
-                <w:sz w:val="16"/>
-                <w:szCs w:val="16"/>
-              </w:rPr>
-              <w:t>Work proceeds without the correct research or service-evaluation approvals.</w:t>
-            </w:r>
-          </w:p>
-          <w:p>
-            <w:pPr>
-              <w:pStyle w:val="ListParagraph"/>
-              <w:numPr>
-                <w:ilvl w:val="0"/>
-                <w:numId w:val="2"/>
-              </w:numPr>
-              <w:spacing w:after="20" w:line="230" w:lineRule="auto"/>
-            </w:pPr>
-            <w:r>
-              <w:rPr>
-                <w:sz w:val="16"/>
-                <w:szCs w:val="16"/>
-              </w:rPr>
-              <w:t>Uncertain medical device classification for a tool that influences care (CE/UKCA).</w:t>
-            </w:r>
-          </w:p>
-          <w:p>
-            <w:pPr>
-              <w:pStyle w:val="ListParagraph"/>
-              <w:numPr>
-                <w:ilvl w:val="0"/>
-                <w:numId w:val="2"/>
-              </w:numPr>
-              <w:spacing w:after="20" w:line="230" w:lineRule="auto"/>
-            </w:pPr>
-            <w:r>
-              <w:rPr>
-                <w:sz w:val="16"/>
-                <w:szCs w:val="16"/>
-              </w:rPr>
-              <w:t>Model performs inequitably across patient groups, or accountability for a clinical decision becomes unclear.</w:t>
-            </w:r>
-          </w:p>
-        </w:tc>
-        <w:tc>
-          <w:tcPr>
-            <w:tcW w:w="4590" w:type="dxa"/>
+              <w:spacing w:after="0"/>
+            </w:pPr>
+            <w:r>
+              <w:rPr>
+                <w:b/>
+                <w:bCs/>
+                <w:sz w:val="18"/>
+                <w:szCs w:val="18"/>
+              </w:rPr>
+              <w:lastRenderedPageBreak/>
+              <w:t>Working hours, lone working and wellbeing</w:t>
+            </w:r>
+          </w:p>
+        </w:tc>
+        <w:tc>
+          <w:tcPr>
+            <w:tcW w:w="2126" w:type="dxa"/>
             <w:tcMar>
               <w:top w:w="70" w:type="dxa"/>
               <w:left w:w="110" w:type="dxa"/>
@@ -8231,86 +8835,11 @@
           </w:tcPr>
           <w:p>
             <w:pPr>
-              <w:pStyle w:val="ListParagraph"/>
-              <w:numPr>
-                <w:ilvl w:val="0"/>
-                <w:numId w:val="2"/>
-              </w:numPr>
-              <w:spacing w:after="20" w:line="230" w:lineRule="auto"/>
-            </w:pPr>
-            <w:r>
-              <w:rPr>
-                <w:sz w:val="16"/>
-                <w:szCs w:val="16"/>
-              </w:rPr>
-              <w:t>HRA decision tool applied at the outset; approvals confirmed in writing before the relevant work begins.</w:t>
-            </w:r>
-          </w:p>
-          <w:p>
-            <w:pPr>
-              <w:pStyle w:val="ListParagraph"/>
-              <w:numPr>
-                <w:ilvl w:val="0"/>
-                <w:numId w:val="2"/>
-              </w:numPr>
-              <w:spacing w:after="20" w:line="230" w:lineRule="auto"/>
-            </w:pPr>
-            <w:r>
-              <w:rPr>
-                <w:sz w:val="16"/>
-                <w:szCs w:val="16"/>
-              </w:rPr>
-              <w:t>Regulatory classification confirmed with the Trust medical device / clinical safety team.</w:t>
-            </w:r>
-          </w:p>
-          <w:p>
-            <w:pPr>
-              <w:pStyle w:val="ListParagraph"/>
-              <w:numPr>
-                <w:ilvl w:val="0"/>
-                <w:numId w:val="2"/>
-              </w:numPr>
-              <w:spacing w:after="20" w:line="230" w:lineRule="auto"/>
-            </w:pPr>
-            <w:r>
-              <w:rPr>
-                <w:sz w:val="16"/>
-                <w:szCs w:val="16"/>
-              </w:rPr>
-              <w:t>Subgroup performance and bias assessment included in the evaluation plan.</w:t>
-            </w:r>
-          </w:p>
-          <w:p>
-            <w:pPr>
-              <w:pStyle w:val="ListParagraph"/>
-              <w:numPr>
-                <w:ilvl w:val="0"/>
-                <w:numId w:val="2"/>
-              </w:numPr>
-              <w:spacing w:after="20" w:line="230" w:lineRule="auto"/>
-            </w:pPr>
-            <w:r>
-              <w:rPr>
-                <w:sz w:val="16"/>
-                <w:szCs w:val="16"/>
-              </w:rPr>
-              <w:t>Accountability for every clinical decision remains with a registered clinician; documented in the project plan.</w:t>
-            </w:r>
-          </w:p>
-        </w:tc>
-        <w:tc>
-          <w:tcPr>
-            <w:tcW w:w="1592" w:type="dxa"/>
-            <w:tcMar>
-              <w:top w:w="70" w:type="dxa"/>
-              <w:left w:w="110" w:type="dxa"/>
-              <w:bottom w:w="70" w:type="dxa"/>
-              <w:right w:w="110" w:type="dxa"/>
-            </w:tcMar>
-          </w:tcPr>
-          <w:p>
-            <w:pPr>
               <w:spacing w:after="20"/>
+              <w:rPr>
+                <w:sz w:val="16"/>
+                <w:szCs w:val="16"/>
+              </w:rPr>
             </w:pPr>
             <w:sdt>
               <w:sdtPr>
@@ -8319,7 +8848,7 @@
                   <w:sz w:val="16"/>
                   <w:szCs w:val="16"/>
                 </w:rPr>
-                <w:id w:val="5049"/>
+                <w:id w:val="-1744022334"/>
                 <w14:checkbox>
                   <w14:checked w14:val="0"/>
                   <w14:checkedState w14:val="2612" w14:font="MS Gothic"/>
@@ -8343,15 +8872,20 @@
                 <w:sz w:val="16"/>
                 <w:szCs w:val="16"/>
               </w:rPr>
-              <w:t xml:space="preserve">  </w:t>
-            </w:r>
-            <w:r>
-              <w:rPr>
-                <w:sz w:val="16"/>
-                <w:szCs w:val="16"/>
-              </w:rPr>
-              <w:t>Low</w:t>
-            </w:r>
+              <w:t xml:space="preserve"> </w:t>
+            </w:r>
+            <w:r>
+              <w:rPr>
+                <w:sz w:val="16"/>
+                <w:szCs w:val="16"/>
+              </w:rPr>
+              <w:t>I have reviewed the fields to the right, and amended where necessary to reflect the risks of the fellow’s activity in this project</w:t>
+            </w:r>
+          </w:p>
+          <w:p>
+            <w:pPr>
+              <w:spacing w:after="20"/>
+            </w:pPr>
           </w:p>
           <w:p>
             <w:pPr>
@@ -8364,7 +8898,7 @@
                   <w:sz w:val="16"/>
                   <w:szCs w:val="16"/>
                 </w:rPr>
-                <w:id w:val="5050"/>
+                <w:id w:val="-498115971"/>
                 <w14:checkbox>
                   <w14:checked w14:val="0"/>
                   <w14:checkedState w14:val="2612" w14:font="MS Gothic"/>
@@ -8388,25 +8922,43 @@
                 <w:sz w:val="16"/>
                 <w:szCs w:val="16"/>
               </w:rPr>
-              <w:t xml:space="preserve">  </w:t>
-            </w:r>
-            <w:r>
-              <w:rPr>
-                <w:sz w:val="16"/>
-                <w:szCs w:val="16"/>
-              </w:rPr>
-              <w:t>High</w:t>
-            </w:r>
-          </w:p>
-        </w:tc>
-      </w:tr>
-      <w:tr>
-        <w:trPr>
-          <w:cantSplit/>
-        </w:trPr>
-        <w:tc>
-          <w:tcPr>
-            <w:tcW w:w="1784" w:type="dxa"/>
+              <w:t xml:space="preserve"> </w:t>
+            </w:r>
+            <w:r>
+              <w:rPr>
+                <w:rFonts w:eastAsia="Segoe UI Symbol"/>
+                <w:sz w:val="16"/>
+                <w:szCs w:val="16"/>
+              </w:rPr>
+              <w:t>Hazard n</w:t>
+            </w:r>
+            <w:r>
+              <w:rPr>
+                <w:sz w:val="16"/>
+                <w:szCs w:val="16"/>
+              </w:rPr>
+              <w:t>ot applicabl</w:t>
+            </w:r>
+            <w:r>
+              <w:rPr>
+                <w:sz w:val="16"/>
+                <w:szCs w:val="16"/>
+              </w:rPr>
+              <w:t xml:space="preserve">e. Reason: </w:t>
+            </w:r>
+            <w:r>
+              <w:rPr>
+                <w:color w:val="425563"/>
+                <w:sz w:val="18"/>
+                <w:szCs w:val="18"/>
+              </w:rPr>
+              <w:t>……</w:t>
+            </w:r>
+          </w:p>
+        </w:tc>
+        <w:tc>
+          <w:tcPr>
+            <w:tcW w:w="3260" w:type="dxa"/>
             <w:tcMar>
               <w:top w:w="70" w:type="dxa"/>
               <w:left w:w="110" w:type="dxa"/>
@@ -8416,23 +8968,226 @@
           </w:tcPr>
           <w:p>
             <w:pPr>
-              <w:spacing w:after="0"/>
-            </w:pPr>
-            <w:r>
-              <w:rPr>
-                <w:b/>
-                <w:bCs/>
-                <w:sz w:val="18"/>
-                <w:szCs w:val="18"/>
-              </w:rPr>
-              <w:lastRenderedPageBreak/>
-              <w:t>Working hours, lone working and wellbeing</w:t>
-            </w:r>
-          </w:p>
-        </w:tc>
-        <w:tc>
-          <w:tcPr>
-            <w:tcW w:w="2165" w:type="dxa"/>
+              <w:pStyle w:val="ListParagraph"/>
+              <w:numPr>
+                <w:ilvl w:val="0"/>
+                <w:numId w:val="2"/>
+              </w:numPr>
+              <w:spacing w:after="20" w:line="230" w:lineRule="auto"/>
+              <w:rPr>
+                <w:color w:val="808080" w:themeColor="background1" w:themeShade="80"/>
+              </w:rPr>
+            </w:pPr>
+            <w:r>
+              <w:rPr>
+                <w:color w:val="808080" w:themeColor="background1" w:themeShade="80"/>
+                <w:sz w:val="16"/>
+                <w:szCs w:val="16"/>
+              </w:rPr>
+              <w:t>Lone working on site or remotely outside normal hours (e.g. data pulls, deployment or go-live windows), where an accident or medical emergency could go unnoticed.</w:t>
+            </w:r>
+          </w:p>
+          <w:p>
+            <w:pPr>
+              <w:pStyle w:val="ListParagraph"/>
+              <w:numPr>
+                <w:ilvl w:val="0"/>
+                <w:numId w:val="2"/>
+              </w:numPr>
+              <w:spacing w:after="20" w:line="230" w:lineRule="auto"/>
+              <w:rPr>
+                <w:color w:val="808080" w:themeColor="background1" w:themeShade="80"/>
+              </w:rPr>
+            </w:pPr>
+            <w:r>
+              <w:rPr>
+                <w:color w:val="808080" w:themeColor="background1" w:themeShade="80"/>
+                <w:sz w:val="16"/>
+                <w:szCs w:val="16"/>
+              </w:rPr>
+              <w:t>Travel to and from site, or movement through unstaffed parts of the site, outside normal hours.</w:t>
+            </w:r>
+          </w:p>
+          <w:p>
+            <w:pPr>
+              <w:pStyle w:val="ListParagraph"/>
+              <w:numPr>
+                <w:ilvl w:val="0"/>
+                <w:numId w:val="2"/>
+              </w:numPr>
+              <w:spacing w:after="20" w:line="230" w:lineRule="auto"/>
+              <w:rPr>
+                <w:color w:val="808080" w:themeColor="background1" w:themeShade="80"/>
+              </w:rPr>
+            </w:pPr>
+            <w:r>
+              <w:rPr>
+                <w:color w:val="808080" w:themeColor="background1" w:themeShade="80"/>
+                <w:sz w:val="16"/>
+                <w:szCs w:val="16"/>
+              </w:rPr>
+              <w:t>Extended or irregular hours around deployment windows, or project work compressed around clinical commitments, causing fatigue that affects the fellow’s health and clinical practice.</w:t>
+            </w:r>
+          </w:p>
+          <w:p>
+            <w:pPr>
+              <w:pStyle w:val="ListParagraph"/>
+              <w:numPr>
+                <w:ilvl w:val="0"/>
+                <w:numId w:val="2"/>
+              </w:numPr>
+              <w:spacing w:after="0" w:line="230" w:lineRule="auto"/>
+              <w:rPr>
+                <w:color w:val="808080" w:themeColor="background1" w:themeShade="80"/>
+              </w:rPr>
+            </w:pPr>
+            <w:r>
+              <w:rPr>
+                <w:color w:val="808080" w:themeColor="background1" w:themeShade="80"/>
+                <w:sz w:val="16"/>
+                <w:szCs w:val="16"/>
+              </w:rPr>
+              <w:t>Separation from the host team and from peers, affecting wellbeing and mental health, with no one positioned to notice.</w:t>
+            </w:r>
+          </w:p>
+        </w:tc>
+        <w:tc>
+          <w:tcPr>
+            <w:tcW w:w="3544" w:type="dxa"/>
+            <w:tcMar>
+              <w:top w:w="70" w:type="dxa"/>
+              <w:left w:w="110" w:type="dxa"/>
+              <w:bottom w:w="70" w:type="dxa"/>
+              <w:right w:w="110" w:type="dxa"/>
+            </w:tcMar>
+          </w:tcPr>
+          <w:p>
+            <w:pPr>
+              <w:pStyle w:val="ListParagraph"/>
+              <w:numPr>
+                <w:ilvl w:val="0"/>
+                <w:numId w:val="2"/>
+              </w:numPr>
+              <w:spacing w:after="20" w:line="230" w:lineRule="auto"/>
+              <w:rPr>
+                <w:color w:val="808080" w:themeColor="background1" w:themeShade="80"/>
+              </w:rPr>
+            </w:pPr>
+            <w:r>
+              <w:rPr>
+                <w:color w:val="808080" w:themeColor="background1" w:themeShade="80"/>
+                <w:sz w:val="16"/>
+                <w:szCs w:val="16"/>
+              </w:rPr>
+              <w:t>Work is scheduled within normal hours by default; any out-of-hours or lone working follows the Trust lone-worker policy with an agreed check-in arrangement.</w:t>
+            </w:r>
+          </w:p>
+          <w:p>
+            <w:pPr>
+              <w:pStyle w:val="ListParagraph"/>
+              <w:numPr>
+                <w:ilvl w:val="0"/>
+                <w:numId w:val="2"/>
+              </w:numPr>
+              <w:spacing w:after="20" w:line="230" w:lineRule="auto"/>
+              <w:rPr>
+                <w:color w:val="808080" w:themeColor="background1" w:themeShade="80"/>
+              </w:rPr>
+            </w:pPr>
+            <w:r>
+              <w:rPr>
+                <w:color w:val="808080" w:themeColor="background1" w:themeShade="80"/>
+                <w:sz w:val="16"/>
+                <w:szCs w:val="16"/>
+              </w:rPr>
+              <w:t xml:space="preserve">Out-of-hours windows are </w:t>
+            </w:r>
+            <w:proofErr w:type="gramStart"/>
+            <w:r>
+              <w:rPr>
+                <w:color w:val="808080" w:themeColor="background1" w:themeShade="80"/>
+                <w:sz w:val="16"/>
+                <w:szCs w:val="16"/>
+              </w:rPr>
+              <w:t>planned in advance</w:t>
+            </w:r>
+            <w:proofErr w:type="gramEnd"/>
+            <w:r>
+              <w:rPr>
+                <w:color w:val="808080" w:themeColor="background1" w:themeShade="80"/>
+                <w:sz w:val="16"/>
+                <w:szCs w:val="16"/>
+              </w:rPr>
+              <w:t>, kept to the minimum, and time back is agreed; Working Time Regulations rest requirements are respected.</w:t>
+            </w:r>
+          </w:p>
+          <w:p>
+            <w:pPr>
+              <w:pStyle w:val="ListParagraph"/>
+              <w:numPr>
+                <w:ilvl w:val="0"/>
+                <w:numId w:val="2"/>
+              </w:numPr>
+              <w:spacing w:after="20" w:line="230" w:lineRule="auto"/>
+              <w:rPr>
+                <w:color w:val="808080" w:themeColor="background1" w:themeShade="80"/>
+              </w:rPr>
+            </w:pPr>
+            <w:r>
+              <w:rPr>
+                <w:color w:val="808080" w:themeColor="background1" w:themeShade="80"/>
+                <w:sz w:val="16"/>
+                <w:szCs w:val="16"/>
+              </w:rPr>
+              <w:t>Where the fellow also holds clinical sessions, project and clinical time are timetabled separately and the split is agreed in writing.</w:t>
+            </w:r>
+          </w:p>
+          <w:p>
+            <w:pPr>
+              <w:pStyle w:val="ListParagraph"/>
+              <w:numPr>
+                <w:ilvl w:val="0"/>
+                <w:numId w:val="2"/>
+              </w:numPr>
+              <w:spacing w:after="20" w:line="230" w:lineRule="auto"/>
+              <w:rPr>
+                <w:color w:val="808080" w:themeColor="background1" w:themeShade="80"/>
+              </w:rPr>
+            </w:pPr>
+            <w:r>
+              <w:rPr>
+                <w:color w:val="808080" w:themeColor="background1" w:themeShade="80"/>
+                <w:sz w:val="16"/>
+                <w:szCs w:val="16"/>
+              </w:rPr>
+              <w:t>Named supervision contact available at least 1 hour per week, plus inclusion in routine team meetings and access to Trust occupational health and staff support services.</w:t>
+            </w:r>
+          </w:p>
+          <w:p>
+            <w:pPr>
+              <w:pStyle w:val="ListParagraph"/>
+              <w:numPr>
+                <w:ilvl w:val="0"/>
+                <w:numId w:val="2"/>
+              </w:numPr>
+              <w:spacing w:after="0" w:line="230" w:lineRule="auto"/>
+              <w:rPr>
+                <w:color w:val="808080" w:themeColor="background1" w:themeShade="80"/>
+              </w:rPr>
+            </w:pPr>
+            <w:r>
+              <w:rPr>
+                <w:color w:val="808080" w:themeColor="background1" w:themeShade="80"/>
+                <w:sz w:val="16"/>
+                <w:szCs w:val="16"/>
+              </w:rPr>
+              <w:t>Fellow has an escalation route to programme faculty independent of the supervisor.</w:t>
+            </w:r>
+          </w:p>
+        </w:tc>
+        <w:tc>
+          <w:tcPr>
+            <w:tcW w:w="3615" w:type="dxa"/>
             <w:tcMar>
               <w:top w:w="70" w:type="dxa"/>
               <w:left w:w="110" w:type="dxa"/>
@@ -8451,7 +9206,52 @@
                   <w:sz w:val="16"/>
                   <w:szCs w:val="16"/>
                 </w:rPr>
-                <w:id w:val="-1003127560"/>
+                <w:id w:val="-1583131788"/>
+                <w14:checkbox>
+                  <w14:checked w14:val="0"/>
+                  <w14:checkedState w14:val="2612" w14:font="MS Gothic"/>
+                  <w14:uncheckedState w14:val="2610" w14:font="MS Gothic"/>
+                </w14:checkbox>
+              </w:sdtPr>
+              <w:sdtContent>
+                <w:r>
+                  <w:rPr>
+                    <w:rFonts w:ascii="MS Gothic" w:eastAsia="MS Gothic" w:hAnsi="MS Gothic" w:hint="eastAsia"/>
+                    <w:sz w:val="16"/>
+                    <w:szCs w:val="16"/>
+                  </w:rPr>
+                  <w:t>☐</w:t>
+                </w:r>
+              </w:sdtContent>
+            </w:sdt>
+            <w:r>
+              <w:rPr>
+                <w:rFonts w:eastAsia="Segoe UI Symbol"/>
+                <w:sz w:val="16"/>
+                <w:szCs w:val="16"/>
+              </w:rPr>
+              <w:t xml:space="preserve">  </w:t>
+            </w:r>
+            <w:r>
+              <w:rPr>
+                <w:sz w:val="16"/>
+                <w:szCs w:val="16"/>
+              </w:rPr>
+              <w:t>Nothing significant</w:t>
+            </w:r>
+          </w:p>
+          <w:p>
+            <w:pPr>
+              <w:spacing w:after="0"/>
+            </w:pPr>
+            <w:sdt>
+              <w:sdtPr>
+                <w:rPr>
+                  <w:rFonts w:eastAsia="MS Gothic"/>
+                  <w:sz w:val="16"/>
+                  <w:szCs w:val="16"/>
+                </w:rPr>
+                <w:id w:val="-284351265"/>
                 <w14:checkbox>
                   <w14:checked w14:val="0"/>
                   <w14:checkedState w14:val="2612" w14:font="MS Gothic"/>
@@ -8475,19 +9275,66 @@
                 <w:sz w:val="16"/>
                 <w:szCs w:val="16"/>
               </w:rPr>
-              <w:t xml:space="preserve"> </w:t>
-            </w:r>
-            <w:r>
-              <w:rPr>
-                <w:sz w:val="16"/>
-                <w:szCs w:val="16"/>
-              </w:rPr>
-              <w:t>I have amended the fields to reflect this project’s hazard profile</w:t>
-            </w:r>
-          </w:p>
+              <w:t xml:space="preserve">  </w:t>
+            </w:r>
+            <w:r>
+              <w:rPr>
+                <w:rFonts w:eastAsia="Segoe UI Symbol"/>
+                <w:sz w:val="16"/>
+                <w:szCs w:val="16"/>
+              </w:rPr>
+              <w:t>Residual risk following mitigation: ……</w:t>
+            </w:r>
+          </w:p>
+        </w:tc>
+      </w:tr>
+      <w:tr>
+        <w:trPr>
+          <w:cantSplit/>
+        </w:trPr>
+        <w:tc>
+          <w:tcPr>
+            <w:tcW w:w="1413" w:type="dxa"/>
+            <w:tcMar>
+              <w:top w:w="70" w:type="dxa"/>
+              <w:left w:w="110" w:type="dxa"/>
+              <w:bottom w:w="70" w:type="dxa"/>
+              <w:right w:w="110" w:type="dxa"/>
+            </w:tcMar>
+          </w:tcPr>
           <w:p>
             <w:pPr>
               <w:spacing w:after="0"/>
+            </w:pPr>
+            <w:r>
+              <w:rPr>
+                <w:b/>
+                <w:bCs/>
+                <w:sz w:val="18"/>
+                <w:szCs w:val="18"/>
+              </w:rPr>
+              <w:lastRenderedPageBreak/>
+              <w:t>Workstation and equipment</w:t>
+            </w:r>
+          </w:p>
+        </w:tc>
+        <w:tc>
+          <w:tcPr>
+            <w:tcW w:w="2126" w:type="dxa"/>
+            <w:tcMar>
+              <w:top w:w="70" w:type="dxa"/>
+              <w:left w:w="110" w:type="dxa"/>
+              <w:bottom w:w="70" w:type="dxa"/>
+              <w:right w:w="110" w:type="dxa"/>
+            </w:tcMar>
+          </w:tcPr>
+          <w:p>
+            <w:pPr>
+              <w:spacing w:after="20"/>
+              <w:rPr>
+                <w:sz w:val="16"/>
+                <w:szCs w:val="16"/>
+              </w:rPr>
             </w:pPr>
             <w:sdt>
               <w:sdtPr>
@@ -8496,7 +9343,7 @@
                   <w:sz w:val="16"/>
                   <w:szCs w:val="16"/>
                 </w:rPr>
-                <w:id w:val="-2141566226"/>
+                <w:id w:val="132760342"/>
                 <w14:checkbox>
                   <w14:checked w14:val="0"/>
                   <w14:checkedState w14:val="2612" w14:font="MS Gothic"/>
@@ -8527,214 +9374,17 @@
                 <w:sz w:val="16"/>
                 <w:szCs w:val="16"/>
               </w:rPr>
-              <w:t>Not applicable</w:t>
-            </w:r>
-          </w:p>
-        </w:tc>
-        <w:tc>
-          <w:tcPr>
-            <w:tcW w:w="3827" w:type="dxa"/>
-            <w:tcMar>
-              <w:top w:w="70" w:type="dxa"/>
-              <w:left w:w="110" w:type="dxa"/>
-              <w:bottom w:w="70" w:type="dxa"/>
-              <w:right w:w="110" w:type="dxa"/>
-            </w:tcMar>
-          </w:tcPr>
-          <w:p>
-            <w:pPr>
-              <w:pStyle w:val="ListParagraph"/>
-              <w:numPr>
-                <w:ilvl w:val="0"/>
-                <w:numId w:val="2"/>
-              </w:numPr>
-              <w:spacing w:after="20" w:line="230" w:lineRule="auto"/>
-            </w:pPr>
-            <w:r>
-              <w:rPr>
-                <w:sz w:val="16"/>
-                <w:szCs w:val="16"/>
-              </w:rPr>
-              <w:t>Lone working on site or remotely outside normal hours (e.g. data pulls, deployment or go-live windows), where an accident or medical emergency could go unnoticed.</w:t>
-            </w:r>
-          </w:p>
-          <w:p>
-            <w:pPr>
-              <w:pStyle w:val="ListParagraph"/>
-              <w:numPr>
-                <w:ilvl w:val="0"/>
-                <w:numId w:val="2"/>
-              </w:numPr>
-              <w:spacing w:after="20" w:line="230" w:lineRule="auto"/>
-            </w:pPr>
-            <w:r>
-              <w:rPr>
-                <w:sz w:val="16"/>
-                <w:szCs w:val="16"/>
-              </w:rPr>
-              <w:t>Travel to and from site, or movement through unstaffed parts of the site, outside normal hours.</w:t>
-            </w:r>
-          </w:p>
-          <w:p>
-            <w:pPr>
-              <w:pStyle w:val="ListParagraph"/>
-              <w:numPr>
-                <w:ilvl w:val="0"/>
-                <w:numId w:val="2"/>
-              </w:numPr>
-              <w:spacing w:after="20" w:line="230" w:lineRule="auto"/>
-            </w:pPr>
-            <w:r>
-              <w:rPr>
-                <w:sz w:val="16"/>
-                <w:szCs w:val="16"/>
-              </w:rPr>
-              <w:t>Extended or irregular hours around deployment windows, or project work compressed around clinical commitments, causing fatigue that affects the fellow’s health and clinical practice.</w:t>
-            </w:r>
-          </w:p>
-          <w:p>
-            <w:pPr>
-              <w:pStyle w:val="ListParagraph"/>
-              <w:numPr>
-                <w:ilvl w:val="0"/>
-                <w:numId w:val="2"/>
-              </w:numPr>
-              <w:spacing w:after="0" w:line="230" w:lineRule="auto"/>
-            </w:pPr>
-            <w:r>
-              <w:rPr>
-                <w:sz w:val="16"/>
-                <w:szCs w:val="16"/>
-              </w:rPr>
-              <w:t>Separation from the host team and from peers, affecting wellbeing and mental health, with no one positioned to notice.</w:t>
-            </w:r>
-          </w:p>
-        </w:tc>
-        <w:tc>
-          <w:tcPr>
-            <w:tcW w:w="4590" w:type="dxa"/>
-            <w:tcMar>
-              <w:top w:w="70" w:type="dxa"/>
-              <w:left w:w="110" w:type="dxa"/>
-              <w:bottom w:w="70" w:type="dxa"/>
-              <w:right w:w="110" w:type="dxa"/>
-            </w:tcMar>
-          </w:tcPr>
-          <w:p>
-            <w:pPr>
-              <w:pStyle w:val="ListParagraph"/>
-              <w:numPr>
-                <w:ilvl w:val="0"/>
-                <w:numId w:val="2"/>
-              </w:numPr>
-              <w:spacing w:after="20" w:line="230" w:lineRule="auto"/>
-            </w:pPr>
-            <w:r>
-              <w:rPr>
-                <w:sz w:val="16"/>
-                <w:szCs w:val="16"/>
-              </w:rPr>
-              <w:t>Work is scheduled within normal hours by default; any out-of-hours or lone working follows the Trust lone-worker policy with an agreed check-in arrangement.</w:t>
-            </w:r>
-          </w:p>
-          <w:p>
-            <w:pPr>
-              <w:pStyle w:val="ListParagraph"/>
-              <w:numPr>
-                <w:ilvl w:val="0"/>
-                <w:numId w:val="2"/>
-              </w:numPr>
-              <w:spacing w:after="20" w:line="230" w:lineRule="auto"/>
-            </w:pPr>
-            <w:r>
-              <w:rPr>
-                <w:sz w:val="16"/>
-                <w:szCs w:val="16"/>
-              </w:rPr>
-              <w:t xml:space="preserve">Out-of-hours windows are </w:t>
-            </w:r>
-            <w:proofErr w:type="gramStart"/>
-            <w:r>
-              <w:rPr>
-                <w:sz w:val="16"/>
-                <w:szCs w:val="16"/>
-              </w:rPr>
-              <w:t>planned in advance</w:t>
-            </w:r>
-            <w:proofErr w:type="gramEnd"/>
-            <w:r>
-              <w:rPr>
-                <w:sz w:val="16"/>
-                <w:szCs w:val="16"/>
-              </w:rPr>
-              <w:t>, kept to the minimum, and time back is agreed; Working Time Regulations rest requirements are respected.</w:t>
-            </w:r>
-          </w:p>
-          <w:p>
-            <w:pPr>
-              <w:pStyle w:val="ListParagraph"/>
-              <w:numPr>
-                <w:ilvl w:val="0"/>
-                <w:numId w:val="2"/>
-              </w:numPr>
-              <w:spacing w:after="20" w:line="230" w:lineRule="auto"/>
-            </w:pPr>
-            <w:r>
-              <w:rPr>
-                <w:sz w:val="16"/>
-                <w:szCs w:val="16"/>
-              </w:rPr>
-              <w:t>Where the fellow also holds clinical sessions, project and clinical time are timetabled separately and the split is agreed in writing.</w:t>
-            </w:r>
-          </w:p>
-          <w:p>
-            <w:pPr>
-              <w:pStyle w:val="ListParagraph"/>
-              <w:numPr>
-                <w:ilvl w:val="0"/>
-                <w:numId w:val="2"/>
-              </w:numPr>
-              <w:spacing w:after="20" w:line="230" w:lineRule="auto"/>
-            </w:pPr>
-            <w:r>
-              <w:rPr>
-                <w:sz w:val="16"/>
-                <w:szCs w:val="16"/>
-              </w:rPr>
-              <w:t>Named supervision contact available at least 1 hour per week, plus inclusion in routine team meetings and access to Trust occupational health and staff support services.</w:t>
-            </w:r>
-          </w:p>
-          <w:p>
-            <w:pPr>
-              <w:pStyle w:val="ListParagraph"/>
-              <w:numPr>
-                <w:ilvl w:val="0"/>
-                <w:numId w:val="2"/>
-              </w:numPr>
-              <w:spacing w:after="0" w:line="230" w:lineRule="auto"/>
-            </w:pPr>
-            <w:r>
-              <w:rPr>
-                <w:sz w:val="16"/>
-                <w:szCs w:val="16"/>
-              </w:rPr>
-              <w:t>Fellow has an escalation route to programme faculty independent of the supervisor.</w:t>
-            </w:r>
-          </w:p>
-        </w:tc>
-        <w:tc>
-          <w:tcPr>
-            <w:tcW w:w="1592" w:type="dxa"/>
-            <w:tcMar>
-              <w:top w:w="70" w:type="dxa"/>
-              <w:left w:w="110" w:type="dxa"/>
-              <w:bottom w:w="70" w:type="dxa"/>
-              <w:right w:w="110" w:type="dxa"/>
-            </w:tcMar>
-          </w:tcPr>
+              <w:t>I have reviewed the fields to the right, and amended where necessary to reflect the risks of the fellow’s activity in this project</w:t>
+            </w:r>
+          </w:p>
           <w:p>
             <w:pPr>
               <w:spacing w:after="20"/>
+            </w:pPr>
+          </w:p>
+          <w:p>
+            <w:pPr>
+              <w:spacing w:after="0"/>
             </w:pPr>
             <w:sdt>
               <w:sdtPr>
@@ -8743,7 +9393,7 @@
                   <w:sz w:val="16"/>
                   <w:szCs w:val="16"/>
                 </w:rPr>
-                <w:id w:val="5054"/>
+                <w:id w:val="-2145733523"/>
                 <w14:checkbox>
                   <w14:checked w14:val="0"/>
                   <w14:checkedState w14:val="2612" w14:font="MS Gothic"/>
@@ -8767,19 +9417,297 @@
                 <w:sz w:val="16"/>
                 <w:szCs w:val="16"/>
               </w:rPr>
-              <w:t xml:space="preserve">  </w:t>
-            </w:r>
-            <w:r>
-              <w:rPr>
-                <w:sz w:val="16"/>
-                <w:szCs w:val="16"/>
-              </w:rPr>
-              <w:t>Low</w:t>
-            </w:r>
-          </w:p>
-          <w:p>
-            <w:pPr>
-              <w:spacing w:after="0"/>
+              <w:t xml:space="preserve"> </w:t>
+            </w:r>
+            <w:r>
+              <w:rPr>
+                <w:rFonts w:eastAsia="Segoe UI Symbol"/>
+                <w:sz w:val="16"/>
+                <w:szCs w:val="16"/>
+              </w:rPr>
+              <w:t>Hazard n</w:t>
+            </w:r>
+            <w:r>
+              <w:rPr>
+                <w:sz w:val="16"/>
+                <w:szCs w:val="16"/>
+              </w:rPr>
+              <w:t>ot applicabl</w:t>
+            </w:r>
+            <w:r>
+              <w:rPr>
+                <w:sz w:val="16"/>
+                <w:szCs w:val="16"/>
+              </w:rPr>
+              <w:t xml:space="preserve">e. Reason: </w:t>
+            </w:r>
+            <w:r>
+              <w:rPr>
+                <w:color w:val="425563"/>
+                <w:sz w:val="18"/>
+                <w:szCs w:val="18"/>
+              </w:rPr>
+              <w:t>……</w:t>
+            </w:r>
+          </w:p>
+        </w:tc>
+        <w:tc>
+          <w:tcPr>
+            <w:tcW w:w="3260" w:type="dxa"/>
+            <w:tcMar>
+              <w:top w:w="70" w:type="dxa"/>
+              <w:left w:w="110" w:type="dxa"/>
+              <w:bottom w:w="70" w:type="dxa"/>
+              <w:right w:w="110" w:type="dxa"/>
+            </w:tcMar>
+          </w:tcPr>
+          <w:p>
+            <w:pPr>
+              <w:pStyle w:val="ListParagraph"/>
+              <w:numPr>
+                <w:ilvl w:val="0"/>
+                <w:numId w:val="2"/>
+              </w:numPr>
+              <w:spacing w:after="20" w:line="230" w:lineRule="auto"/>
+              <w:rPr>
+                <w:color w:val="808080" w:themeColor="background1" w:themeShade="80"/>
+              </w:rPr>
+            </w:pPr>
+            <w:r>
+              <w:rPr>
+                <w:color w:val="808080" w:themeColor="background1" w:themeShade="80"/>
+                <w:sz w:val="16"/>
+                <w:szCs w:val="16"/>
+              </w:rPr>
+              <w:t>Prolonged screen, keyboard and mouse work causing musculoskeletal disorders and eye strain, including at unassessed home, hot-desk or borrowed workstations.</w:t>
+            </w:r>
+          </w:p>
+          <w:p>
+            <w:pPr>
+              <w:pStyle w:val="ListParagraph"/>
+              <w:numPr>
+                <w:ilvl w:val="0"/>
+                <w:numId w:val="2"/>
+              </w:numPr>
+              <w:spacing w:after="20" w:line="230" w:lineRule="auto"/>
+              <w:rPr>
+                <w:color w:val="808080" w:themeColor="background1" w:themeShade="80"/>
+              </w:rPr>
+            </w:pPr>
+            <w:r>
+              <w:rPr>
+                <w:color w:val="808080" w:themeColor="background1" w:themeShade="80"/>
+                <w:sz w:val="16"/>
+                <w:szCs w:val="16"/>
+              </w:rPr>
+              <w:t xml:space="preserve">Manual handling and electrical injury where the fellow moves or </w:t>
+            </w:r>
+            <w:proofErr w:type="gramStart"/>
+            <w:r>
+              <w:rPr>
+                <w:color w:val="808080" w:themeColor="background1" w:themeShade="80"/>
+                <w:sz w:val="16"/>
+                <w:szCs w:val="16"/>
+              </w:rPr>
+              <w:t>sets</w:t>
+            </w:r>
+            <w:proofErr w:type="gramEnd"/>
+            <w:r>
+              <w:rPr>
+                <w:color w:val="808080" w:themeColor="background1" w:themeShade="80"/>
+                <w:sz w:val="16"/>
+                <w:szCs w:val="16"/>
+              </w:rPr>
+              <w:t xml:space="preserve"> up hardware (workstations, monitors, GPU or edge devices, trolleys) or uses portable electrical equipment.</w:t>
+            </w:r>
+          </w:p>
+          <w:p>
+            <w:pPr>
+              <w:pStyle w:val="ListParagraph"/>
+              <w:numPr>
+                <w:ilvl w:val="0"/>
+                <w:numId w:val="2"/>
+              </w:numPr>
+              <w:spacing w:after="20" w:line="230" w:lineRule="auto"/>
+              <w:rPr>
+                <w:color w:val="808080" w:themeColor="background1" w:themeShade="80"/>
+              </w:rPr>
+            </w:pPr>
+            <w:r>
+              <w:rPr>
+                <w:color w:val="808080" w:themeColor="background1" w:themeShade="80"/>
+                <w:sz w:val="16"/>
+                <w:szCs w:val="16"/>
+              </w:rPr>
+              <w:t>Heat, noise, restricted access, trip hazards from cabling, and lone working where the fellow enters server rooms, comms cupboards or plant areas.</w:t>
+            </w:r>
+          </w:p>
+          <w:p>
+            <w:pPr>
+              <w:pStyle w:val="ListParagraph"/>
+              <w:numPr>
+                <w:ilvl w:val="0"/>
+                <w:numId w:val="2"/>
+              </w:numPr>
+              <w:spacing w:after="0" w:line="230" w:lineRule="auto"/>
+              <w:rPr>
+                <w:color w:val="808080" w:themeColor="background1" w:themeShade="80"/>
+              </w:rPr>
+            </w:pPr>
+            <w:r>
+              <w:rPr>
+                <w:color w:val="808080" w:themeColor="background1" w:themeShade="80"/>
+                <w:sz w:val="16"/>
+                <w:szCs w:val="16"/>
+              </w:rPr>
+              <w:t>Infection transmission and trip hazards where devices, cables or trolleys are taken into clinical areas or to the bedside.</w:t>
+            </w:r>
+          </w:p>
+        </w:tc>
+        <w:tc>
+          <w:tcPr>
+            <w:tcW w:w="3544" w:type="dxa"/>
+            <w:tcMar>
+              <w:top w:w="70" w:type="dxa"/>
+              <w:left w:w="110" w:type="dxa"/>
+              <w:bottom w:w="70" w:type="dxa"/>
+              <w:right w:w="110" w:type="dxa"/>
+            </w:tcMar>
+          </w:tcPr>
+          <w:p>
+            <w:pPr>
+              <w:pStyle w:val="ListParagraph"/>
+              <w:numPr>
+                <w:ilvl w:val="0"/>
+                <w:numId w:val="2"/>
+              </w:numPr>
+              <w:spacing w:after="20" w:line="230" w:lineRule="auto"/>
+              <w:rPr>
+                <w:color w:val="808080" w:themeColor="background1" w:themeShade="80"/>
+              </w:rPr>
+            </w:pPr>
+            <w:r>
+              <w:rPr>
+                <w:color w:val="808080" w:themeColor="background1" w:themeShade="80"/>
+                <w:sz w:val="16"/>
+                <w:szCs w:val="16"/>
+              </w:rPr>
+              <w:t>A suitable desk, chair and screen at each site the fellow works from. Concerns raised with the supervisor and referred to occupational health for adjustment. Regular screen breaks.</w:t>
+            </w:r>
+          </w:p>
+          <w:p>
+            <w:pPr>
+              <w:pStyle w:val="ListParagraph"/>
+              <w:numPr>
+                <w:ilvl w:val="0"/>
+                <w:numId w:val="2"/>
+              </w:numPr>
+              <w:spacing w:after="20" w:line="230" w:lineRule="auto"/>
+              <w:rPr>
+                <w:color w:val="808080" w:themeColor="background1" w:themeShade="80"/>
+              </w:rPr>
+            </w:pPr>
+            <w:r>
+              <w:rPr>
+                <w:color w:val="808080" w:themeColor="background1" w:themeShade="80"/>
+                <w:sz w:val="16"/>
+                <w:szCs w:val="16"/>
+              </w:rPr>
+              <w:t xml:space="preserve">Hardware moves and installations are carried out by IT or estates; portable appliance testing and the Trust electrical safety policy apply; the fellow does </w:t>
+            </w:r>
+            <w:proofErr w:type="gramStart"/>
+            <w:r>
+              <w:rPr>
+                <w:color w:val="808080" w:themeColor="background1" w:themeShade="80"/>
+                <w:sz w:val="16"/>
+                <w:szCs w:val="16"/>
+              </w:rPr>
+              <w:t>no</w:t>
+            </w:r>
+            <w:proofErr w:type="gramEnd"/>
+            <w:r>
+              <w:rPr>
+                <w:color w:val="808080" w:themeColor="background1" w:themeShade="80"/>
+                <w:sz w:val="16"/>
+                <w:szCs w:val="16"/>
+              </w:rPr>
+              <w:t xml:space="preserve"> work on fixed electrical installations.</w:t>
+            </w:r>
+          </w:p>
+          <w:p>
+            <w:pPr>
+              <w:pStyle w:val="ListParagraph"/>
+              <w:numPr>
+                <w:ilvl w:val="0"/>
+                <w:numId w:val="2"/>
+              </w:numPr>
+              <w:spacing w:after="20" w:line="230" w:lineRule="auto"/>
+              <w:rPr>
+                <w:color w:val="808080" w:themeColor="background1" w:themeShade="80"/>
+              </w:rPr>
+            </w:pPr>
+            <w:r>
+              <w:rPr>
+                <w:color w:val="808080" w:themeColor="background1" w:themeShade="80"/>
+                <w:sz w:val="16"/>
+                <w:szCs w:val="16"/>
+              </w:rPr>
+              <w:t>Server room, comms and plant area access only with local authorisation and area induction, accompanied where policy requires, and under the lone-worker arrangements above.</w:t>
+            </w:r>
+          </w:p>
+          <w:p>
+            <w:pPr>
+              <w:pStyle w:val="ListParagraph"/>
+              <w:numPr>
+                <w:ilvl w:val="0"/>
+                <w:numId w:val="2"/>
+              </w:numPr>
+              <w:spacing w:after="0" w:line="230" w:lineRule="auto"/>
+              <w:rPr>
+                <w:color w:val="808080" w:themeColor="background1" w:themeShade="80"/>
+              </w:rPr>
+            </w:pPr>
+            <w:r>
+              <w:rPr>
+                <w:color w:val="808080" w:themeColor="background1" w:themeShade="80"/>
+                <w:sz w:val="16"/>
+                <w:szCs w:val="16"/>
+              </w:rPr>
+              <w:t xml:space="preserve">Devices used in clinical areas are decontaminated to local infection prevention and control policy between uses; cables are routed and </w:t>
+            </w:r>
+            <w:proofErr w:type="gramStart"/>
+            <w:r>
+              <w:rPr>
+                <w:color w:val="808080" w:themeColor="background1" w:themeShade="80"/>
+                <w:sz w:val="16"/>
+                <w:szCs w:val="16"/>
+              </w:rPr>
+              <w:t>secured</w:t>
+            </w:r>
+            <w:proofErr w:type="gramEnd"/>
+            <w:r>
+              <w:rPr>
+                <w:color w:val="808080" w:themeColor="background1" w:themeShade="80"/>
+                <w:sz w:val="16"/>
+                <w:szCs w:val="16"/>
+              </w:rPr>
+              <w:t xml:space="preserve"> and nothing is left in walkways.</w:t>
+            </w:r>
+          </w:p>
+        </w:tc>
+        <w:tc>
+          <w:tcPr>
+            <w:tcW w:w="3615" w:type="dxa"/>
+            <w:tcMar>
+              <w:top w:w="70" w:type="dxa"/>
+              <w:left w:w="110" w:type="dxa"/>
+              <w:bottom w:w="70" w:type="dxa"/>
+              <w:right w:w="110" w:type="dxa"/>
+            </w:tcMar>
+          </w:tcPr>
+          <w:p>
+            <w:pPr>
+              <w:spacing w:after="20"/>
             </w:pPr>
             <w:sdt>
               <w:sdtPr>
@@ -8788,7 +9716,52 @@
                   <w:sz w:val="16"/>
                   <w:szCs w:val="16"/>
                 </w:rPr>
-                <w:id w:val="5055"/>
+                <w:id w:val="1668129699"/>
+                <w14:checkbox>
+                  <w14:checked w14:val="0"/>
+                  <w14:checkedState w14:val="2612" w14:font="MS Gothic"/>
+                  <w14:uncheckedState w14:val="2610" w14:font="MS Gothic"/>
+                </w14:checkbox>
+              </w:sdtPr>
+              <w:sdtContent>
+                <w:r>
+                  <w:rPr>
+                    <w:rFonts w:ascii="MS Gothic" w:eastAsia="MS Gothic" w:hAnsi="MS Gothic" w:hint="eastAsia"/>
+                    <w:sz w:val="16"/>
+                    <w:szCs w:val="16"/>
+                  </w:rPr>
+                  <w:t>☐</w:t>
+                </w:r>
+              </w:sdtContent>
+            </w:sdt>
+            <w:r>
+              <w:rPr>
+                <w:rFonts w:eastAsia="Segoe UI Symbol"/>
+                <w:sz w:val="16"/>
+                <w:szCs w:val="16"/>
+              </w:rPr>
+              <w:t xml:space="preserve">  </w:t>
+            </w:r>
+            <w:r>
+              <w:rPr>
+                <w:sz w:val="16"/>
+                <w:szCs w:val="16"/>
+              </w:rPr>
+              <w:t>Nothing significant</w:t>
+            </w:r>
+          </w:p>
+          <w:p>
+            <w:pPr>
+              <w:spacing w:after="0"/>
+            </w:pPr>
+            <w:sdt>
+              <w:sdtPr>
+                <w:rPr>
+                  <w:rFonts w:eastAsia="MS Gothic"/>
+                  <w:sz w:val="16"/>
+                  <w:szCs w:val="16"/>
+                </w:rPr>
+                <w:id w:val="130214441"/>
                 <w14:checkbox>
                   <w14:checked w14:val="0"/>
                   <w14:checkedState w14:val="2612" w14:font="MS Gothic"/>
@@ -8816,10 +9789,11 @@
             </w:r>
             <w:r>
               <w:rPr>
-                <w:sz w:val="16"/>
-                <w:szCs w:val="16"/>
-              </w:rPr>
-              <w:t>High</w:t>
+                <w:rFonts w:eastAsia="Segoe UI Symbol"/>
+                <w:sz w:val="16"/>
+                <w:szCs w:val="16"/>
+              </w:rPr>
+              <w:t>Residual risk following mitigation: ……</w:t>
             </w:r>
           </w:p>
         </w:tc>
@@ -8830,7 +9804,7 @@
         </w:trPr>
         <w:tc>
           <w:tcPr>
-            <w:tcW w:w="1784" w:type="dxa"/>
+            <w:tcW w:w="1413" w:type="dxa"/>
             <w:tcMar>
               <w:top w:w="70" w:type="dxa"/>
               <w:left w:w="110" w:type="dxa"/>
@@ -8840,7 +9814,7 @@
           </w:tcPr>
           <w:p>
             <w:pPr>
-              <w:spacing w:after="0"/>
+              <w:spacing w:after="20"/>
             </w:pPr>
             <w:r>
               <w:rPr>
@@ -8849,472 +9823,6 @@
                 <w:sz w:val="18"/>
                 <w:szCs w:val="18"/>
               </w:rPr>
-              <w:t>Workstation and equipment</w:t>
-            </w:r>
-          </w:p>
-        </w:tc>
-        <w:tc>
-          <w:tcPr>
-            <w:tcW w:w="2165" w:type="dxa"/>
-            <w:tcMar>
-              <w:top w:w="70" w:type="dxa"/>
-              <w:left w:w="110" w:type="dxa"/>
-              <w:bottom w:w="70" w:type="dxa"/>
-              <w:right w:w="110" w:type="dxa"/>
-            </w:tcMar>
-          </w:tcPr>
-          <w:p>
-            <w:pPr>
-              <w:spacing w:after="20"/>
-            </w:pPr>
-            <w:sdt>
-              <w:sdtPr>
-                <w:rPr>
-                  <w:rFonts w:eastAsia="MS Gothic"/>
-                  <w:sz w:val="16"/>
-                  <w:szCs w:val="16"/>
-                </w:rPr>
-                <w:id w:val="-6285518"/>
-                <w14:checkbox>
-                  <w14:checked w14:val="0"/>
-                  <w14:checkedState w14:val="2612" w14:font="MS Gothic"/>
-                  <w14:uncheckedState w14:val="2610" w14:font="MS Gothic"/>
-                </w14:checkbox>
-              </w:sdtPr>
-              <w:sdtContent>
-                <w:r>
-                  <w:rPr>
-                    <w:rFonts w:ascii="Segoe UI Symbol" w:eastAsia="MS Gothic" w:hAnsi="Segoe UI Symbol" w:cs="Segoe UI Symbol"/>
-                    <w:sz w:val="16"/>
-                    <w:szCs w:val="16"/>
-                  </w:rPr>
-                  <w:t>☐</w:t>
-                </w:r>
-              </w:sdtContent>
-            </w:sdt>
-            <w:r>
-              <w:rPr>
-                <w:rFonts w:eastAsia="Segoe UI Symbol"/>
-                <w:sz w:val="16"/>
-                <w:szCs w:val="16"/>
-              </w:rPr>
-              <w:t xml:space="preserve"> </w:t>
-            </w:r>
-            <w:r>
-              <w:rPr>
-                <w:sz w:val="16"/>
-                <w:szCs w:val="16"/>
-              </w:rPr>
-              <w:t>I have amended the fields to reflect this project’s hazard profile</w:t>
-            </w:r>
-          </w:p>
-          <w:p>
-            <w:pPr>
-              <w:spacing w:after="0"/>
-            </w:pPr>
-            <w:sdt>
-              <w:sdtPr>
-                <w:rPr>
-                  <w:rFonts w:eastAsia="MS Gothic"/>
-                  <w:sz w:val="16"/>
-                  <w:szCs w:val="16"/>
-                </w:rPr>
-                <w:id w:val="928087794"/>
-                <w14:checkbox>
-                  <w14:checked w14:val="0"/>
-                  <w14:checkedState w14:val="2612" w14:font="MS Gothic"/>
-                  <w14:uncheckedState w14:val="2610" w14:font="MS Gothic"/>
-                </w14:checkbox>
-              </w:sdtPr>
-              <w:sdtContent>
-                <w:r>
-                  <w:rPr>
-                    <w:rFonts w:ascii="Segoe UI Symbol" w:eastAsia="MS Gothic" w:hAnsi="Segoe UI Symbol" w:cs="Segoe UI Symbol"/>
-                    <w:sz w:val="16"/>
-                    <w:szCs w:val="16"/>
-                  </w:rPr>
-                  <w:t>☐</w:t>
-                </w:r>
-              </w:sdtContent>
-            </w:sdt>
-            <w:r>
-              <w:rPr>
-                <w:rFonts w:eastAsia="Segoe UI Symbol"/>
-                <w:sz w:val="16"/>
-                <w:szCs w:val="16"/>
-              </w:rPr>
-              <w:t xml:space="preserve"> </w:t>
-            </w:r>
-            <w:r>
-              <w:rPr>
-                <w:sz w:val="16"/>
-                <w:szCs w:val="16"/>
-              </w:rPr>
-              <w:t>Not applicable</w:t>
-            </w:r>
-          </w:p>
-        </w:tc>
-        <w:tc>
-          <w:tcPr>
-            <w:tcW w:w="3827" w:type="dxa"/>
-            <w:tcMar>
-              <w:top w:w="70" w:type="dxa"/>
-              <w:left w:w="110" w:type="dxa"/>
-              <w:bottom w:w="70" w:type="dxa"/>
-              <w:right w:w="110" w:type="dxa"/>
-            </w:tcMar>
-          </w:tcPr>
-          <w:p>
-            <w:pPr>
-              <w:pStyle w:val="ListParagraph"/>
-              <w:numPr>
-                <w:ilvl w:val="0"/>
-                <w:numId w:val="2"/>
-              </w:numPr>
-              <w:spacing w:after="20" w:line="230" w:lineRule="auto"/>
-            </w:pPr>
-            <w:r>
-              <w:rPr>
-                <w:sz w:val="16"/>
-                <w:szCs w:val="16"/>
-              </w:rPr>
-              <w:t>Prolonged screen, keyboard and mouse work causing musculoskeletal disorders and eye strain, including at unassessed home, hot-desk or borrowed workstations.</w:t>
-            </w:r>
-          </w:p>
-          <w:p>
-            <w:pPr>
-              <w:pStyle w:val="ListParagraph"/>
-              <w:numPr>
-                <w:ilvl w:val="0"/>
-                <w:numId w:val="2"/>
-              </w:numPr>
-              <w:spacing w:after="20" w:line="230" w:lineRule="auto"/>
-            </w:pPr>
-            <w:r>
-              <w:rPr>
-                <w:sz w:val="16"/>
-                <w:szCs w:val="16"/>
-              </w:rPr>
-              <w:t xml:space="preserve">Manual handling and electrical injury where the fellow moves or </w:t>
-            </w:r>
-            <w:proofErr w:type="gramStart"/>
-            <w:r>
-              <w:rPr>
-                <w:sz w:val="16"/>
-                <w:szCs w:val="16"/>
-              </w:rPr>
-              <w:t>sets</w:t>
-            </w:r>
-            <w:proofErr w:type="gramEnd"/>
-            <w:r>
-              <w:rPr>
-                <w:sz w:val="16"/>
-                <w:szCs w:val="16"/>
-              </w:rPr>
-              <w:t xml:space="preserve"> up hardware (workstations, monitors, GPU or edge devices, trolleys) or uses portable electrical equipment.</w:t>
-            </w:r>
-          </w:p>
-          <w:p>
-            <w:pPr>
-              <w:pStyle w:val="ListParagraph"/>
-              <w:numPr>
-                <w:ilvl w:val="0"/>
-                <w:numId w:val="2"/>
-              </w:numPr>
-              <w:spacing w:after="20" w:line="230" w:lineRule="auto"/>
-            </w:pPr>
-            <w:r>
-              <w:rPr>
-                <w:sz w:val="16"/>
-                <w:szCs w:val="16"/>
-              </w:rPr>
-              <w:t>Heat, noise, restricted access, trip hazards from cabling, and lone working where the fellow enters server rooms, comms cupboards or plant areas.</w:t>
-            </w:r>
-          </w:p>
-          <w:p>
-            <w:pPr>
-              <w:pStyle w:val="ListParagraph"/>
-              <w:numPr>
-                <w:ilvl w:val="0"/>
-                <w:numId w:val="2"/>
-              </w:numPr>
-              <w:spacing w:after="0" w:line="230" w:lineRule="auto"/>
-            </w:pPr>
-            <w:r>
-              <w:rPr>
-                <w:sz w:val="16"/>
-                <w:szCs w:val="16"/>
-              </w:rPr>
-              <w:t>Infection transmission and trip hazards where devices, cables or trolleys are taken into clinical areas or to the bedside.</w:t>
-            </w:r>
-          </w:p>
-        </w:tc>
-        <w:tc>
-          <w:tcPr>
-            <w:tcW w:w="4590" w:type="dxa"/>
-            <w:tcMar>
-              <w:top w:w="70" w:type="dxa"/>
-              <w:left w:w="110" w:type="dxa"/>
-              <w:bottom w:w="70" w:type="dxa"/>
-              <w:right w:w="110" w:type="dxa"/>
-            </w:tcMar>
-          </w:tcPr>
-          <w:p>
-            <w:pPr>
-              <w:pStyle w:val="ListParagraph"/>
-              <w:numPr>
-                <w:ilvl w:val="0"/>
-                <w:numId w:val="2"/>
-              </w:numPr>
-              <w:spacing w:after="20" w:line="230" w:lineRule="auto"/>
-            </w:pPr>
-            <w:r>
-              <w:rPr>
-                <w:sz w:val="16"/>
-                <w:szCs w:val="16"/>
-              </w:rPr>
-              <w:t xml:space="preserve">A suitable desk, chair and screen at each site the fellow works from. </w:t>
-            </w:r>
-            <w:r>
-              <w:rPr>
-                <w:sz w:val="16"/>
-                <w:szCs w:val="16"/>
-              </w:rPr>
-              <w:t>Concerns</w:t>
-            </w:r>
-            <w:r>
-              <w:rPr>
-                <w:sz w:val="16"/>
-                <w:szCs w:val="16"/>
-              </w:rPr>
-              <w:t xml:space="preserve"> raised with the supervisor and referred to occupational health for adjustment</w:t>
-            </w:r>
-            <w:r>
-              <w:rPr>
-                <w:sz w:val="16"/>
-                <w:szCs w:val="16"/>
-              </w:rPr>
-              <w:t>. R</w:t>
-            </w:r>
-            <w:r>
-              <w:rPr>
-                <w:sz w:val="16"/>
-                <w:szCs w:val="16"/>
-              </w:rPr>
-              <w:t>egular screen breaks.</w:t>
-            </w:r>
-          </w:p>
-          <w:p>
-            <w:pPr>
-              <w:pStyle w:val="ListParagraph"/>
-              <w:numPr>
-                <w:ilvl w:val="0"/>
-                <w:numId w:val="2"/>
-              </w:numPr>
-              <w:spacing w:after="20" w:line="230" w:lineRule="auto"/>
-            </w:pPr>
-            <w:r>
-              <w:rPr>
-                <w:sz w:val="16"/>
-                <w:szCs w:val="16"/>
-              </w:rPr>
-              <w:t xml:space="preserve">Hardware moves and installations are carried out by IT or estates; portable appliance testing and the Trust electrical safety policy apply; the fellow does </w:t>
-            </w:r>
-            <w:proofErr w:type="gramStart"/>
-            <w:r>
-              <w:rPr>
-                <w:sz w:val="16"/>
-                <w:szCs w:val="16"/>
-              </w:rPr>
-              <w:t>no</w:t>
-            </w:r>
-            <w:proofErr w:type="gramEnd"/>
-            <w:r>
-              <w:rPr>
-                <w:sz w:val="16"/>
-                <w:szCs w:val="16"/>
-              </w:rPr>
-              <w:t xml:space="preserve"> work on fixed electrical installations.</w:t>
-            </w:r>
-          </w:p>
-          <w:p>
-            <w:pPr>
-              <w:pStyle w:val="ListParagraph"/>
-              <w:numPr>
-                <w:ilvl w:val="0"/>
-                <w:numId w:val="2"/>
-              </w:numPr>
-              <w:spacing w:after="20" w:line="230" w:lineRule="auto"/>
-            </w:pPr>
-            <w:r>
-              <w:rPr>
-                <w:sz w:val="16"/>
-                <w:szCs w:val="16"/>
-              </w:rPr>
-              <w:t>Server room, comms and plant area access only with local authorisation and area induction, accompanied where policy requires, and under the lone-worker arrangements above.</w:t>
-            </w:r>
-          </w:p>
-          <w:p>
-            <w:pPr>
-              <w:pStyle w:val="ListParagraph"/>
-              <w:numPr>
-                <w:ilvl w:val="0"/>
-                <w:numId w:val="2"/>
-              </w:numPr>
-              <w:spacing w:after="0" w:line="230" w:lineRule="auto"/>
-            </w:pPr>
-            <w:r>
-              <w:rPr>
-                <w:sz w:val="16"/>
-                <w:szCs w:val="16"/>
-              </w:rPr>
-              <w:t xml:space="preserve">Devices used in clinical areas are decontaminated to local infection prevention and control policy between uses; cables are routed and </w:t>
-            </w:r>
-            <w:proofErr w:type="gramStart"/>
-            <w:r>
-              <w:rPr>
-                <w:sz w:val="16"/>
-                <w:szCs w:val="16"/>
-              </w:rPr>
-              <w:t>secured</w:t>
-            </w:r>
-            <w:proofErr w:type="gramEnd"/>
-            <w:r>
-              <w:rPr>
-                <w:sz w:val="16"/>
-                <w:szCs w:val="16"/>
-              </w:rPr>
-              <w:t xml:space="preserve"> and nothing is left in walkways.</w:t>
-            </w:r>
-          </w:p>
-        </w:tc>
-        <w:tc>
-          <w:tcPr>
-            <w:tcW w:w="1592" w:type="dxa"/>
-            <w:tcMar>
-              <w:top w:w="70" w:type="dxa"/>
-              <w:left w:w="110" w:type="dxa"/>
-              <w:bottom w:w="70" w:type="dxa"/>
-              <w:right w:w="110" w:type="dxa"/>
-            </w:tcMar>
-          </w:tcPr>
-          <w:p>
-            <w:pPr>
-              <w:spacing w:after="20"/>
-            </w:pPr>
-            <w:sdt>
-              <w:sdtPr>
-                <w:rPr>
-                  <w:rFonts w:eastAsia="MS Gothic"/>
-                  <w:sz w:val="16"/>
-                  <w:szCs w:val="16"/>
-                </w:rPr>
-                <w:id w:val="5059"/>
-                <w14:checkbox>
-                  <w14:checked w14:val="0"/>
-                  <w14:checkedState w14:val="2612" w14:font="MS Gothic"/>
-                  <w14:uncheckedState w14:val="2610" w14:font="MS Gothic"/>
-                </w14:checkbox>
-              </w:sdtPr>
-              <w:sdtContent>
-                <w:r>
-                  <w:rPr>
-                    <w:rFonts w:ascii="Segoe UI Symbol" w:eastAsia="MS Gothic" w:hAnsi="Segoe UI Symbol" w:cs="Segoe UI Symbol"/>
-                    <w:sz w:val="16"/>
-                    <w:szCs w:val="16"/>
-                  </w:rPr>
-                  <w:t>☐</w:t>
-                </w:r>
-              </w:sdtContent>
-            </w:sdt>
-            <w:r>
-              <w:rPr>
-                <w:rFonts w:eastAsia="Segoe UI Symbol"/>
-                <w:sz w:val="16"/>
-                <w:szCs w:val="16"/>
-              </w:rPr>
-              <w:t xml:space="preserve">  </w:t>
-            </w:r>
-            <w:r>
-              <w:rPr>
-                <w:sz w:val="16"/>
-                <w:szCs w:val="16"/>
-              </w:rPr>
-              <w:t>Low</w:t>
-            </w:r>
-          </w:p>
-          <w:p>
-            <w:pPr>
-              <w:spacing w:after="0"/>
-            </w:pPr>
-            <w:sdt>
-              <w:sdtPr>
-                <w:rPr>
-                  <w:rFonts w:eastAsia="MS Gothic"/>
-                  <w:sz w:val="16"/>
-                  <w:szCs w:val="16"/>
-                </w:rPr>
-                <w:id w:val="5060"/>
-                <w14:checkbox>
-                  <w14:checked w14:val="0"/>
-                  <w14:checkedState w14:val="2612" w14:font="MS Gothic"/>
-                  <w14:uncheckedState w14:val="2610" w14:font="MS Gothic"/>
-                </w14:checkbox>
-              </w:sdtPr>
-              <w:sdtContent>
-                <w:r>
-                  <w:rPr>
-                    <w:rFonts w:ascii="Segoe UI Symbol" w:eastAsia="MS Gothic" w:hAnsi="Segoe UI Symbol" w:cs="Segoe UI Symbol"/>
-                    <w:sz w:val="16"/>
-                    <w:szCs w:val="16"/>
-                  </w:rPr>
-                  <w:t>☐</w:t>
-                </w:r>
-              </w:sdtContent>
-            </w:sdt>
-            <w:r>
-              <w:rPr>
-                <w:rFonts w:eastAsia="Segoe UI Symbol"/>
-                <w:sz w:val="16"/>
-                <w:szCs w:val="16"/>
-              </w:rPr>
-              <w:t xml:space="preserve">  </w:t>
-            </w:r>
-            <w:r>
-              <w:rPr>
-                <w:sz w:val="16"/>
-                <w:szCs w:val="16"/>
-              </w:rPr>
-              <w:t>High</w:t>
-            </w:r>
-          </w:p>
-        </w:tc>
-      </w:tr>
-      <w:tr>
-        <w:trPr>
-          <w:cantSplit/>
-        </w:trPr>
-        <w:tc>
-          <w:tcPr>
-            <w:tcW w:w="1784" w:type="dxa"/>
-            <w:tcMar>
-              <w:top w:w="70" w:type="dxa"/>
-              <w:left w:w="110" w:type="dxa"/>
-              <w:bottom w:w="70" w:type="dxa"/>
-              <w:right w:w="110" w:type="dxa"/>
-            </w:tcMar>
-          </w:tcPr>
-          <w:p>
-            <w:pPr>
-              <w:spacing w:after="20"/>
-            </w:pPr>
-            <w:r>
-              <w:rPr>
-                <w:b/>
-                <w:bCs/>
-                <w:sz w:val="18"/>
-                <w:szCs w:val="18"/>
-              </w:rPr>
               <w:t>Other hazards identified</w:t>
             </w:r>
           </w:p>
@@ -9336,7 +9844,7 @@
         </w:tc>
         <w:tc>
           <w:tcPr>
-            <w:tcW w:w="2165" w:type="dxa"/>
+            <w:tcW w:w="2126" w:type="dxa"/>
             <w:tcMar>
               <w:top w:w="70" w:type="dxa"/>
               <w:left w:w="110" w:type="dxa"/>
@@ -9437,7 +9945,7 @@
         </w:tc>
         <w:tc>
           <w:tcPr>
-            <w:tcW w:w="3827" w:type="dxa"/>
+            <w:tcW w:w="3260" w:type="dxa"/>
             <w:tcMar>
               <w:top w:w="70" w:type="dxa"/>
               <w:left w:w="110" w:type="dxa"/>
@@ -9463,7 +9971,7 @@
         </w:tc>
         <w:tc>
           <w:tcPr>
-            <w:tcW w:w="4590" w:type="dxa"/>
+            <w:tcW w:w="3544" w:type="dxa"/>
             <w:tcMar>
               <w:top w:w="70" w:type="dxa"/>
               <w:left w:w="110" w:type="dxa"/>
@@ -9489,7 +9997,7 @@
         </w:tc>
         <w:tc>
           <w:tcPr>
-            <w:tcW w:w="1592" w:type="dxa"/>
+            <w:tcW w:w="3615" w:type="dxa"/>
             <w:tcMar>
               <w:top w:w="70" w:type="dxa"/>
               <w:left w:w="110" w:type="dxa"/>
@@ -9508,7 +10016,52 @@
                   <w:sz w:val="16"/>
                   <w:szCs w:val="16"/>
                 </w:rPr>
-                <w:id w:val="5063"/>
+                <w:id w:val="494618181"/>
+                <w14:checkbox>
+                  <w14:checked w14:val="0"/>
+                  <w14:checkedState w14:val="2612" w14:font="MS Gothic"/>
+                  <w14:uncheckedState w14:val="2610" w14:font="MS Gothic"/>
+                </w14:checkbox>
+              </w:sdtPr>
+              <w:sdtContent>
+                <w:r>
+                  <w:rPr>
+                    <w:rFonts w:ascii="MS Gothic" w:eastAsia="MS Gothic" w:hAnsi="MS Gothic" w:hint="eastAsia"/>
+                    <w:sz w:val="16"/>
+                    <w:szCs w:val="16"/>
+                  </w:rPr>
+                  <w:t>☐</w:t>
+                </w:r>
+              </w:sdtContent>
+            </w:sdt>
+            <w:r>
+              <w:rPr>
+                <w:rFonts w:eastAsia="Segoe UI Symbol"/>
+                <w:sz w:val="16"/>
+                <w:szCs w:val="16"/>
+              </w:rPr>
+              <w:t xml:space="preserve">  </w:t>
+            </w:r>
+            <w:r>
+              <w:rPr>
+                <w:sz w:val="16"/>
+                <w:szCs w:val="16"/>
+              </w:rPr>
+              <w:t>Nothing significant</w:t>
+            </w:r>
+          </w:p>
+          <w:p>
+            <w:pPr>
+              <w:spacing w:after="0"/>
+            </w:pPr>
+            <w:sdt>
+              <w:sdtPr>
+                <w:rPr>
+                  <w:rFonts w:eastAsia="MS Gothic"/>
+                  <w:sz w:val="16"/>
+                  <w:szCs w:val="16"/>
+                </w:rPr>
+                <w:id w:val="636694174"/>
                 <w14:checkbox>
                   <w14:checked w14:val="0"/>
                   <w14:checkedState w14:val="2612" w14:font="MS Gothic"/>
@@ -9536,55 +10089,11 @@
             </w:r>
             <w:r>
               <w:rPr>
-                <w:sz w:val="16"/>
-                <w:szCs w:val="16"/>
-              </w:rPr>
-              <w:t>Low</w:t>
-            </w:r>
-          </w:p>
-          <w:p>
-            <w:pPr>
-              <w:spacing w:after="0"/>
-            </w:pPr>
-            <w:sdt>
-              <w:sdtPr>
-                <w:rPr>
-                  <w:rFonts w:eastAsia="MS Gothic"/>
-                  <w:sz w:val="16"/>
-                  <w:szCs w:val="16"/>
-                </w:rPr>
-                <w:id w:val="5064"/>
-                <w14:checkbox>
-                  <w14:checked w14:val="0"/>
-                  <w14:checkedState w14:val="2612" w14:font="MS Gothic"/>
-                  <w14:uncheckedState w14:val="2610" w14:font="MS Gothic"/>
-                </w14:checkbox>
-              </w:sdtPr>
-              <w:sdtContent>
-                <w:r>
-                  <w:rPr>
-                    <w:rFonts w:ascii="Segoe UI Symbol" w:eastAsia="MS Gothic" w:hAnsi="Segoe UI Symbol" w:cs="Segoe UI Symbol"/>
-                    <w:sz w:val="16"/>
-                    <w:szCs w:val="16"/>
-                  </w:rPr>
-                  <w:t>☐</w:t>
-                </w:r>
-              </w:sdtContent>
-            </w:sdt>
-            <w:r>
-              <w:rPr>
                 <w:rFonts w:eastAsia="Segoe UI Symbol"/>
                 <w:sz w:val="16"/>
                 <w:szCs w:val="16"/>
               </w:rPr>
-              <w:t xml:space="preserve">  </w:t>
-            </w:r>
-            <w:r>
-              <w:rPr>
-                <w:sz w:val="16"/>
-                <w:szCs w:val="16"/>
-              </w:rPr>
-              <w:t>High</w:t>
+              <w:t>Residual risk following mitigation: ……</w:t>
             </w:r>
           </w:p>
         </w:tc>
@@ -11854,7 +12363,6 @@
   <w:style w:type="character" w:default="1" w:styleId="DefaultParagraphFont">
     <w:name w:val="Default Paragraph Font"/>
     <w:uiPriority w:val="1"/>
-    <w:semiHidden/>
     <w:unhideWhenUsed/>
   </w:style>
   <w:style w:type="table" w:default="1" w:styleId="TableNormal">

</xml_diff>